<commit_message>
Add RENPHO McLaren-focus script and reconnect opening for Moncler
RENPHO is a second-touch discovery script: reconnect greeting, the
as-promised George handover, McLaren interest acknowledged and
explored, the brand-agnostic recommendations frame, a flipped talk
ratio so the brand does the talking, and a verified McLaren picture
with champion-pricing honesty. Moncler gets the same reconnect
opening in Part 1.

Co-Authored-By: Claude Fable 5 <noreply@anthropic.com>
Claude-Session: https://claude.ai/code/session_011Vvxd2V3zerAfjn84yXuuv
</commit_message>
<xml_diff>
--- a/call-scripts/Moncler-F1-Discovery-Call-Script.docx
+++ b/call-scripts/Moncler-F1-Discovery-Call-Script.docx
@@ -63,7 +63,7 @@
         <w:t xml:space="preserve">Call type:</w:t>
       </w:r>
       <w:r>
-        <w:t xml:space="preserve"> First call / discovery. Goal: introduce yourself and SPORTFIVE, understand Moncler's objectives, fill out the brief, show how F1 fits a luxury house, agree next steps.</w:t>
+        <w:t xml:space="preserve"> Discovery, second touch: you connected with [Name] last week, so the opening is a reconnect, not a first meeting. Goal: bring in the right people as promised, understand Moncler's objectives, fill out the brief, show how F1 fits a luxury house, agree next steps.</w:t>
       </w:r>
     </w:p>
     <w:p>
@@ -806,20 +806,46 @@
           <w:sz w:val="20"/>
           <w:szCs w:val="20"/>
         </w:rPr>
-        <w:t xml:space="preserve">[After hellos and small talk. Smile. Take your time.]</w:t>
-      </w:r>
-    </w:p>
-    <w:p>
-      <w:pPr>
-        <w:pBdr>
-          <w:left w:val="single" w:color="1F3864" w:sz="18"/>
-        </w:pBdr>
-        <w:shd w:fill="F2F4F8" w:val="clear"/>
-        <w:spacing w:after="160" w:before="80" w:line="264"/>
-        <w:ind w:left="280" w:right="120"/>
-      </w:pPr>
-      <w:r>
-        <w:t xml:space="preserve">"Thank you for making the time, [Name]. Before we get into it, let me quickly introduce myself and SPORTFIVE. Then I will explain what I would like us to do with this call. Sound good?"</w:t>
+        <w:t xml:space="preserve">[This is a reconnect, not a first meeting. Warm and familiar with [Name]; the fuller background is for anyone on their side who is new. Smile. Take your time.]</w:t>
+      </w:r>
+    </w:p>
+    <w:p>
+      <w:pPr>
+        <w:pBdr>
+          <w:left w:val="single" w:color="1F3864" w:sz="18"/>
+        </w:pBdr>
+        <w:shd w:fill="F2F4F8" w:val="clear"/>
+        <w:spacing w:after="60" w:before="80" w:line="264"/>
+        <w:ind w:left="280" w:right="120"/>
+      </w:pPr>
+      <w:r>
+        <w:t xml:space="preserve">"[Name], great to connect again. It was a pleasure speaking last week, and thank you for making the time today.</w:t>
+      </w:r>
+    </w:p>
+    <w:p>
+      <w:pPr>
+        <w:pBdr>
+          <w:left w:val="single" w:color="1F3864" w:sz="18"/>
+        </w:pBdr>
+        <w:shd w:fill="F2F4F8" w:val="clear"/>
+        <w:spacing w:after="60" w:before="0" w:line="264"/>
+        <w:ind w:left="280" w:right="120"/>
+      </w:pPr>
+      <w:r>
+        <w:t xml:space="preserve">As promised, I wanted to involve the right people for this conversation. So joining me is George, who I work very closely with on our Formula 1 business.</w:t>
+      </w:r>
+    </w:p>
+    <w:p>
+      <w:pPr>
+        <w:pBdr>
+          <w:left w:val="single" w:color="1F3864" w:sz="18"/>
+        </w:pBdr>
+        <w:shd w:fill="F2F4F8" w:val="clear"/>
+        <w:spacing w:after="160" w:before="0" w:line="264"/>
+        <w:ind w:left="280" w:right="120"/>
+      </w:pPr>
+      <w:r>
+        <w:t xml:space="preserve">For anyone who was not part of last week's chat, let me give a quick background on myself and SPORTFIVE. Then I will explain what I would like us to do with this call. Sound good?"</w:t>
       </w:r>
     </w:p>
     <w:p>

</xml_diff>

<commit_message>
Polish the Moncler opening and personal intro
The greeting now thanks them and names the moment, fashion as an
integral part of F1. The bio gets the fuller Middle East story:
exclusive accounts, the region's biggest football clubs, esports and
gaming as a strategic focus with the Saudi government's esports
project, then F1 as the top priority project and an easy yes.

Co-Authored-By: Claude Fable 5 <noreply@anthropic.com>
Claude-Session: https://claude.ai/code/session_011Vvxd2V3zerAfjn84yXuuv
</commit_message>
<xml_diff>
--- a/call-scripts/Moncler-F1-Discovery-Call-Script.docx
+++ b/call-scripts/Moncler-F1-Discovery-Call-Script.docx
@@ -397,7 +397,7 @@
         <w:spacing w:after="60"/>
       </w:pPr>
       <w:r>
-        <w:t xml:space="preserve">[Example partnership] for the Middle East story in Part 1, if you want one</w:t>
+        <w:t xml:space="preserve">Optional: one named example from the Middle East years (football or esports) ready for Part 1, if asked</w:t>
       </w:r>
     </w:p>
     <w:p>
@@ -819,7 +819,7 @@
         <w:ind w:left="280" w:right="120"/>
       </w:pPr>
       <w:r>
-        <w:t xml:space="preserve">"[Name], great to connect again. It was a pleasure speaking last week, and thank you for making the time today.</w:t>
+        <w:t xml:space="preserve">"[Name], great to connect again. It was a pleasure speaking last week, and thank you for making the time today. And let me say it: it is great to be speaking with an amazing brand like Moncler, especially at this point in time, when fashion has become such an integral part of Formula 1.</w:t>
       </w:r>
     </w:p>
     <w:p>
@@ -880,7 +880,20 @@
         <w:ind w:left="280" w:right="120"/>
       </w:pPr>
       <w:r>
-        <w:t xml:space="preserve">I spent most of my career in the Middle East. There I was tasked with driving partnerships for the accounts we worked with exclusively, mainly in football and gaming, and we closed some notable strategic partnerships in those years.</w:t>
+        <w:t xml:space="preserve">A little on my background. I was part of our Middle East team, where I drove partnerships for the exclusive accounts we worked with. In those years we worked with some of the biggest football clubs in the region. And esports and gaming was a key strategic focus for us there: among other things, we worked closely with the Saudi government's esports project.</w:t>
+      </w:r>
+    </w:p>
+    <w:p>
+      <w:pPr>
+        <w:pBdr>
+          <w:left w:val="single" w:color="1F3864" w:sz="18"/>
+        </w:pBdr>
+        <w:shd w:fill="F2F4F8" w:val="clear"/>
+        <w:spacing w:after="60" w:before="0" w:line="264"/>
+        <w:ind w:left="280" w:right="120"/>
+      </w:pPr>
+      <w:r>
+        <w:t xml:space="preserve">Then Formula 1 became a top priority project within SPORTFIVE, a global vertical of the business, and I had the opportunity to be part of a great team. As you can imagine, that was an easy yes.</w:t>
       </w:r>
     </w:p>
     <w:p>
@@ -893,7 +906,7 @@
         <w:ind w:left="280" w:right="120"/>
       </w:pPr>
       <w:r>
-        <w:t xml:space="preserve">Then Formula 1 became a priority project for us, a global vertical of the business. My role in it is simple: drive strategic partnerships that work for both the brand and the rights holder. I do that together with Bjorn, and with George, who is here on the call."</w:t>
+        <w:t xml:space="preserve">My role is simple: drive strategic partnerships that work for both the brand and the rights holder. I do that together with Bjorn, and with George, who you will hear from today."</w:t>
       </w:r>
     </w:p>
     <w:p>

</xml_diff>

<commit_message>
Add the timely-opportunity beat to the Moncler why-now
The homework now lands as three reading-based reasons, Grenoble's
performance soul, the Genius and Mondo G appetite for bold company,
and the US and Asia growth push, closing on the soft ask: a timely
opportunity to at least have the conversation and see where the
brand stands.

Co-Authored-By: Claude Fable 5 <noreply@anthropic.com>
Claude-Session: https://claude.ai/code/session_011Vvxd2V3zerAfjn84yXuuv
</commit_message>
<xml_diff>
--- a/call-scripts/Moncler-F1-Discovery-Call-Script.docx
+++ b/call-scripts/Moncler-F1-Discovery-Call-Script.docx
@@ -1117,20 +1117,46 @@
         <w:ind w:left="280" w:right="120"/>
       </w:pPr>
       <w:r>
-        <w:t xml:space="preserve">I did my homework on Moncler. A brand born in the French Alps in the 1950s, making jackets for the mountain. Then Mr Ruffini turned it into one of the great luxury stories of our time: more than three billion euros today, with Stone Island alongside. And what interests me most is how you work now. Grenoble keeps the performance soul. Genius turned collaboration into a platform. You even built a car with Mercedes-Benz, Project Mondo G. This is a house that likes bold partnerships.</w:t>
-      </w:r>
-    </w:p>
-    <w:p>
-      <w:pPr>
-        <w:pBdr>
-          <w:left w:val="single" w:color="1F3864" w:sz="18"/>
-        </w:pBdr>
-        <w:shd w:fill="F2F4F8" w:val="clear"/>
-        <w:spacing w:after="60" w:before="0" w:line="264"/>
-        <w:ind w:left="280" w:right="120"/>
-      </w:pPr>
-      <w:r>
-        <w:t xml:space="preserve">And the timing is why I picked up the phone. Fashion and luxury are moving into Formula 1 right now. Louis Vuitton has its name on the Monaco Grand Prix. TAG Heuer on Madrid. Moet is back on the podium. Brioni dresses the Alpine team, Tommy Hilfiger is with the new Cadillac team, Hugo Boss with Racing Bulls. The seats are being taken one by one. So a conversation with Moncler felt timely.</w:t>
+        <w:t xml:space="preserve">I did my homework on Moncler. A brand born in the French Alps in the 1950s, making jackets for the mountain. Then Mr Ruffini turned it into one of the great luxury stories of our time: more than three billion euros today, with Stone Island alongside.</w:t>
+      </w:r>
+    </w:p>
+    <w:p>
+      <w:pPr>
+        <w:pBdr>
+          <w:left w:val="single" w:color="1F3864" w:sz="18"/>
+        </w:pBdr>
+        <w:shd w:fill="F2F4F8" w:val="clear"/>
+        <w:spacing w:after="60" w:before="0" w:line="264"/>
+        <w:ind w:left="280" w:right="120"/>
+      </w:pPr>
+      <w:r>
+        <w:t xml:space="preserve">And from the reading we did around Moncler, a few things stood out to us. One, the performance soul is still there: Grenoble is real mountain wear, built for it. Two, this is a house that likes bold company: Genius turned collaboration into a platform, and you even built a car with Mercedes-Benz, Project Mondo G. And three, your growth push is the US and Asia. This sport is booming in the US, three races now, and the calendar covers Asia's key cities.</w:t>
+      </w:r>
+    </w:p>
+    <w:p>
+      <w:pPr>
+        <w:pBdr>
+          <w:left w:val="single" w:color="1F3864" w:sz="18"/>
+        </w:pBdr>
+        <w:shd w:fill="F2F4F8" w:val="clear"/>
+        <w:spacing w:after="60" w:before="0" w:line="264"/>
+        <w:ind w:left="280" w:right="120"/>
+      </w:pPr>
+      <w:r>
+        <w:t xml:space="preserve">Put that next to the timing. Fashion and luxury are moving into Formula 1 right now. Louis Vuitton has its name on the Monaco Grand Prix. TAG Heuer on Madrid. Moet is back on the podium. Brioni dresses the Alpine team, Tommy Hilfiger is with the new Cadillac team, Hugo Boss with Racing Bulls. The seats are being taken one by one.</w:t>
+      </w:r>
+    </w:p>
+    <w:p>
+      <w:pPr>
+        <w:pBdr>
+          <w:left w:val="single" w:color="1F3864" w:sz="18"/>
+        </w:pBdr>
+        <w:shd w:fill="F2F4F8" w:val="clear"/>
+        <w:spacing w:after="60" w:before="0" w:line="264"/>
+        <w:ind w:left="280" w:right="120"/>
+      </w:pPr>
+      <w:r>
+        <w:t xml:space="preserve">So for those reasons, we simply thought it was a timely opportunity to at least have this conversation, and to see where the brand stands. Nothing more than that today.</w:t>
       </w:r>
     </w:p>
     <w:p>

</xml_diff>

<commit_message>
Rework the Moncler opening around Bjorn and Ellery
Polished greeting, general background without the Middle East
specifics, the insights and growth-vehicle purpose, timing broadened
to motorsport as a whole, and the not-one-dimensional SPORTFIVE beat
introducing the athlete department, with quick hellos from Bjorn and
Ellery before handing the floor to Moncler.

Co-Authored-By: Claude Fable 5 <noreply@anthropic.com>
Claude-Session: https://claude.ai/code/session_011Vvxd2V3zerAfjn84yXuuv
</commit_message>
<xml_diff>
--- a/call-scripts/Moncler-F1-Discovery-Call-Script.docx
+++ b/call-scripts/Moncler-F1-Discovery-Call-Script.docx
@@ -174,10 +174,10 @@
           <w:b/>
           <w:bCs/>
         </w:rPr>
-        <w:t xml:space="preserve">Frame the call: purpose, homework on Moncler, why now.</w:t>
-      </w:r>
-      <w:r>
-        <w:t xml:space="preserve"> 2 min</w:t>
+        <w:t xml:space="preserve">Frame the call: purpose, homework on Moncler, why now, hellos from Bjorn and Ellery.</w:t>
+      </w:r>
+      <w:r>
+        <w:t xml:space="preserve"> 3 min</w:t>
       </w:r>
     </w:p>
     <w:p>
@@ -323,7 +323,7 @@
         <w:t xml:space="preserve">We start from your objectives.</w:t>
       </w:r>
       <w:r>
-        <w:t xml:space="preserve"> Brand-first, non-exclusive across the grid, and the teams pay our fee. Everything we do for Moncler is free.</w:t>
+        <w:t xml:space="preserve"> Brand-first, non-exclusive across the grid, and the teams pay our fee. Everything we do for Moncler is free. And we are not one-dimensional: beyond Formula 1, our athlete department opens routes across sport.</w:t>
       </w:r>
     </w:p>
     <w:p>
@@ -397,7 +397,7 @@
         <w:spacing w:after="60"/>
       </w:pPr>
       <w:r>
-        <w:t xml:space="preserve">Optional: one named example from the Middle East years (football or esports) ready for Part 1, if asked</w:t>
+        <w:t xml:space="preserve">Optional: one named Middle East example ready, only if they ask about your background</w:t>
       </w:r>
     </w:p>
     <w:p>
@@ -423,7 +423,20 @@
         <w:spacing w:after="60"/>
       </w:pPr>
       <w:r>
-        <w:t xml:space="preserve">Confirm Bjorn's and George's name spellings for any follow-up email</w:t>
+        <w:t xml:space="preserve">Brief Bjorn and Ellery for their quick hellos; Ellery ready with one line on the athlete department</w:t>
+      </w:r>
+    </w:p>
+    <w:p>
+      <w:pPr>
+        <w:pStyle w:val="ListParagraph"/>
+        <w:numPr>
+          <w:ilvl w:val="0"/>
+          <w:numId w:val="3"/>
+        </w:numPr>
+        <w:spacing w:after="60"/>
+      </w:pPr>
+      <w:r>
+        <w:t xml:space="preserve">Confirm Bjorn's and Ellery's name spellings for any follow-up email</w:t>
       </w:r>
     </w:p>
     <w:p>
@@ -819,20 +832,20 @@
         <w:ind w:left="280" w:right="120"/>
       </w:pPr>
       <w:r>
-        <w:t xml:space="preserve">"[Name], great to connect again. It was a pleasure speaking last week, and thank you for making the time today. And let me say it: it is great to be speaking with an amazing brand like Moncler, especially at this point in time, when fashion has become such an integral part of Formula 1.</w:t>
-      </w:r>
-    </w:p>
-    <w:p>
-      <w:pPr>
-        <w:pBdr>
-          <w:left w:val="single" w:color="1F3864" w:sz="18"/>
-        </w:pBdr>
-        <w:shd w:fill="F2F4F8" w:val="clear"/>
-        <w:spacing w:after="60" w:before="0" w:line="264"/>
-        <w:ind w:left="280" w:right="120"/>
-      </w:pPr>
-      <w:r>
-        <w:t xml:space="preserve">As promised, I wanted to involve the right people for this conversation. So joining me is George, who I work very closely with on our Formula 1 business.</w:t>
+        <w:t xml:space="preserve">"[Name], great to connect again. It was a pleasure speaking last week, and thank you for the time today. I really appreciate it. And let me say it: it is a pleasure to be speaking with an amazing brand like Moncler, at a moment when fashion has become such an integral part of motorsport, and of Formula 1 above all.</w:t>
+      </w:r>
+    </w:p>
+    <w:p>
+      <w:pPr>
+        <w:pBdr>
+          <w:left w:val="single" w:color="1F3864" w:sz="18"/>
+        </w:pBdr>
+        <w:shd w:fill="F2F4F8" w:val="clear"/>
+        <w:spacing w:after="60" w:before="0" w:line="264"/>
+        <w:ind w:left="280" w:right="120"/>
+      </w:pPr>
+      <w:r>
+        <w:t xml:space="preserve">As promised, I wanted to involve the right people for this conversation. So joining me today are Bjorn, who I work very closely with on our Formula 1 business, and Ellery, who is part of our athlete department. I will explain in a moment why I wanted them both here.</w:t>
       </w:r>
     </w:p>
     <w:p>
@@ -880,20 +893,7 @@
         <w:ind w:left="280" w:right="120"/>
       </w:pPr>
       <w:r>
-        <w:t xml:space="preserve">A little on my background. I was part of our Middle East team, where I drove partnerships for the exclusive accounts we worked with. In those years we worked with some of the biggest football clubs in the region. And esports and gaming was a key strategic focus for us there: among other things, we worked closely with the Saudi government's esports project.</w:t>
-      </w:r>
-    </w:p>
-    <w:p>
-      <w:pPr>
-        <w:pBdr>
-          <w:left w:val="single" w:color="1F3864" w:sz="18"/>
-        </w:pBdr>
-        <w:shd w:fill="F2F4F8" w:val="clear"/>
-        <w:spacing w:after="60" w:before="0" w:line="264"/>
-        <w:ind w:left="280" w:right="120"/>
-      </w:pPr>
-      <w:r>
-        <w:t xml:space="preserve">Then Formula 1 became a top priority project within SPORTFIVE, a global vertical of the business, and I had the opportunity to be part of a great team. As you can imagine, that was an easy yes.</w:t>
+        <w:t xml:space="preserve">A little on my background. I was part of our Middle East business, where I drove partnerships for the exclusive accounts we worked with across the region. Then Formula 1 became a top priority project within SPORTFIVE, a global vertical of the business, and I had the opportunity to be part of a great team. As you can imagine, that was an easy yes.</w:t>
       </w:r>
     </w:p>
     <w:p>
@@ -906,7 +906,7 @@
         <w:ind w:left="280" w:right="120"/>
       </w:pPr>
       <w:r>
-        <w:t xml:space="preserve">My role is simple: drive strategic partnerships that work for both the brand and the rights holder. I do that together with Bjorn, and with George, who you will hear from today."</w:t>
+        <w:t xml:space="preserve">My role is simple: drive strategic partnerships that work for both the brand and the rights holder."</w:t>
       </w:r>
     </w:p>
     <w:p>
@@ -1024,11 +1024,59 @@
     </w:p>
     <w:p>
       <w:pPr>
+        <w:pStyle w:val="Heading3"/>
+        <w:spacing w:after="100" w:before="240"/>
+      </w:pPr>
+      <w:r>
+        <w:t xml:space="preserve">Why this team, on this call</w:t>
+      </w:r>
+    </w:p>
+    <w:p>
+      <w:pPr>
+        <w:pBdr>
+          <w:left w:val="single" w:color="1F3864" w:sz="18"/>
+        </w:pBdr>
+        <w:shd w:fill="F2F4F8" w:val="clear"/>
+        <w:spacing w:after="60" w:before="80" w:line="264"/>
+        <w:ind w:left="280" w:right="120"/>
+      </w:pPr>
+      <w:r>
+        <w:t xml:space="preserve">"And one more thing about us, because it explains who is sitting with me today.</w:t>
+      </w:r>
+    </w:p>
+    <w:p>
+      <w:pPr>
+        <w:pBdr>
+          <w:left w:val="single" w:color="1F3864" w:sz="18"/>
+        </w:pBdr>
+        <w:shd w:fill="F2F4F8" w:val="clear"/>
+        <w:spacing w:after="60" w:before="0" w:line="264"/>
+        <w:ind w:left="280" w:right="120"/>
+      </w:pPr>
+      <w:r>
+        <w:t xml:space="preserve">SPORTFIVE is not a one-dimensional agency. Formula 1 is one side of what we do, and a big one. But we have other business functions across sport, including a dedicated athlete department.</w:t>
+      </w:r>
+    </w:p>
+    <w:p>
+      <w:pPr>
+        <w:pBdr>
+          <w:left w:val="single" w:color="1F3864" w:sz="18"/>
+        </w:pBdr>
+        <w:shd w:fill="F2F4F8" w:val="clear"/>
+        <w:spacing w:after="160" w:before="0" w:line="264"/>
+        <w:ind w:left="280" w:right="120"/>
+      </w:pPr>
+      <w:r>
+        <w:t xml:space="preserve">Why does that matter for Moncler? Because it means we can explore opportunities beyond Formula 1 alone. For a house like yours, an athlete angle could make a lot of sense as well. That is exactly why I asked Ellery to join us today."</w:t>
+      </w:r>
+    </w:p>
+    <w:p>
+      <w:pPr>
         <w:pStyle w:val="Heading1"/>
         <w:spacing w:after="160" w:before="360"/>
       </w:pPr>
       <w:r>
-        <w:t xml:space="preserve">Part 2: Frame the call (2 minutes)</w:t>
+        <w:t xml:space="preserve">Part 2: Frame the call (2 to 3 minutes)</w:t>
       </w:r>
     </w:p>
     <w:p>
@@ -1054,7 +1102,7 @@
         <w:ind w:left="280" w:right="120"/>
       </w:pPr>
       <w:r>
-        <w:t xml:space="preserve">This is a discovery call. Ideally, we work closely with you to build a brief, and then we come back with recommendations that truly align with it. So today I want to do two things: learn about Moncler and your objectives, and give you clarity on how Formula 1 partnerships work wherever that is useful. I will ask some questions along the way that help us fill out the brief. Nothing formal.</w:t>
+        <w:t xml:space="preserve">This is a discovery call. We want to gather some insights, understand the brand better, and see how sport could be a vehicle in helping drive Moncler's growth. Ideally, we work closely with you to build a brief, and then we come back with recommendations that truly align with it. I will ask some questions along the way that help us fill out the brief. Nothing formal.</w:t>
       </w:r>
     </w:p>
     <w:p>
@@ -1143,7 +1191,7 @@
         <w:ind w:left="280" w:right="120"/>
       </w:pPr>
       <w:r>
-        <w:t xml:space="preserve">Put that next to the timing. Fashion and luxury are moving into Formula 1 right now. Louis Vuitton has its name on the Monaco Grand Prix. TAG Heuer on Madrid. Moet is back on the podium. Brioni dresses the Alpine team, Tommy Hilfiger is with the new Cadillac team, Hugo Boss with Racing Bulls. The seats are being taken one by one.</w:t>
+        <w:t xml:space="preserve">Put that next to the timing. Fashion and luxury are moving into motorsport as a whole right now, and Formula 1 is where it is loudest. Louis Vuitton has its name on the Monaco Grand Prix. TAG Heuer on Madrid. Moet is back on the podium. Brioni dresses the Alpine team, Tommy Hilfiger is with the new Cadillac team, Hugo Boss with Racing Bulls. The seats are being taken one by one.</w:t>
       </w:r>
     </w:p>
     <w:p>
@@ -1184,7 +1232,7 @@
           <w:sz w:val="20"/>
           <w:szCs w:val="20"/>
         </w:rPr>
-        <w:t xml:space="preserve">[Then open softly. Their answer sets the depth for Part 4:]</w:t>
+        <w:t xml:space="preserve">[Hand over for quick hellos. Keep it short:]</w:t>
       </w:r>
     </w:p>
     <w:p>
@@ -1197,16 +1245,7 @@
         <w:ind w:left="280" w:right="120"/>
       </w:pPr>
       <w:r>
-        <w:t xml:space="preserve">"Let me start simple. How much do you follow Formula 1? And has Moncler looked at sport before, beyond ski?"</w:t>
-      </w:r>
-    </w:p>
-    <w:p>
-      <w:pPr>
-        <w:pStyle w:val="Heading1"/>
-        <w:spacing w:after="160" w:before="360"/>
-      </w:pPr>
-      <w:r>
-        <w:t xml:space="preserve">Part 3: The brief. Key discovery questions (12 to 15 minutes)</w:t>
+        <w:t xml:space="preserve">"Before we go any further, let me hand over to Bjorn and Ellery for a quick hello."</w:t>
       </w:r>
     </w:p>
     <w:p>
@@ -1221,270 +1260,29 @@
           <w:sz w:val="20"/>
           <w:szCs w:val="20"/>
         </w:rPr>
-        <w:t xml:space="preserve">[Work through these as a conversation, not a checklist. Follow their energy. The bold labels are for you; the questions are for them. Capture answers, they become the brief.]</w:t>
-      </w:r>
-    </w:p>
-    <w:p>
-      <w:pPr>
-        <w:pStyle w:val="Heading3"/>
-        <w:spacing w:after="100" w:before="240"/>
-      </w:pPr>
-      <w:r>
-        <w:t xml:space="preserve">Objectives</w:t>
-      </w:r>
-    </w:p>
-    <w:p>
-      <w:pPr>
-        <w:pStyle w:val="ListParagraph"/>
-        <w:numPr>
-          <w:ilvl w:val="0"/>
-          <w:numId w:val="2"/>
-        </w:numPr>
-        <w:spacing w:after="60"/>
-      </w:pPr>
-      <w:r>
-        <w:t xml:space="preserve">"What would Formula 1 need to do for Moncler? New audiences, heat for the brand, a bigger stage in the US and Asia, or something else?"</w:t>
-      </w:r>
-    </w:p>
-    <w:p>
-      <w:pPr>
-        <w:pStyle w:val="ListParagraph"/>
-        <w:numPr>
-          <w:ilvl w:val="0"/>
-          <w:numId w:val="2"/>
-        </w:numPr>
-        <w:spacing w:after="60"/>
-      </w:pPr>
-      <w:r>
-        <w:t xml:space="preserve">"Imagine this works perfectly. Three years from now, what has changed for Moncler because of it?"</w:t>
-      </w:r>
-    </w:p>
-    <w:p>
-      <w:pPr>
-        <w:pStyle w:val="Heading3"/>
-        <w:spacing w:after="100" w:before="240"/>
-      </w:pPr>
-      <w:r>
-        <w:t xml:space="preserve">Brand fit</w:t>
-      </w:r>
-    </w:p>
-    <w:p>
-      <w:pPr>
-        <w:pStyle w:val="ListParagraph"/>
-        <w:numPr>
-          <w:ilvl w:val="0"/>
-          <w:numId w:val="2"/>
-        </w:numPr>
-        <w:spacing w:after="60"/>
-      </w:pPr>
-      <w:r>
-        <w:t xml:space="preserve">"Moncler means the mountain, craft, and now co-creation through Genius. Which of those stories would you want Formula 1 to amplify?"</w:t>
-      </w:r>
-    </w:p>
-    <w:p>
-      <w:pPr>
-        <w:pStyle w:val="ListParagraph"/>
-        <w:numPr>
-          <w:ilvl w:val="0"/>
-          <w:numId w:val="2"/>
-        </w:numPr>
-        <w:spacing w:after="60"/>
-      </w:pPr>
-      <w:r>
-        <w:t xml:space="preserve">"Project Mondo G was a statement piece with Mercedes-Benz. Did that appetite for the automotive world continue inside the house?"</w:t>
-      </w:r>
-    </w:p>
-    <w:p>
-      <w:pPr>
-        <w:pStyle w:val="Heading3"/>
-        <w:spacing w:after="100" w:before="240"/>
-      </w:pPr>
-      <w:r>
-        <w:t xml:space="preserve">Audience</w:t>
-      </w:r>
-    </w:p>
-    <w:p>
-      <w:pPr>
-        <w:pStyle w:val="ListParagraph"/>
-        <w:numPr>
-          <w:ilvl w:val="0"/>
-          <w:numId w:val="2"/>
-        </w:numPr>
-        <w:spacing w:after="60"/>
-      </w:pPr>
-      <w:r>
-        <w:t xml:space="preserve">"Who is the customer you most want to win next: younger, more female, more American, more Asian?"</w:t>
-      </w:r>
-    </w:p>
-    <w:p>
-      <w:pPr>
-        <w:pStyle w:val="ListParagraph"/>
-        <w:numPr>
-          <w:ilvl w:val="0"/>
-          <w:numId w:val="2"/>
-        </w:numPr>
-        <w:spacing w:after="60"/>
-      </w:pPr>
-      <w:r>
-        <w:t xml:space="preserve">"How important is reaching new customers versus giving something special to your existing clients?"</w:t>
-      </w:r>
-    </w:p>
-    <w:p>
-      <w:pPr>
-        <w:pStyle w:val="Heading3"/>
-        <w:spacing w:after="100" w:before="240"/>
-      </w:pPr>
-      <w:r>
-        <w:t xml:space="preserve">Markets</w:t>
-      </w:r>
-    </w:p>
-    <w:p>
-      <w:pPr>
-        <w:pStyle w:val="ListParagraph"/>
-        <w:numPr>
-          <w:ilvl w:val="0"/>
-          <w:numId w:val="2"/>
-        </w:numPr>
-        <w:spacing w:after="60"/>
-      </w:pPr>
-      <w:r>
-        <w:t xml:space="preserve">"Which markets matter most for the next three years? The calendar covers all of them: Monaco, Miami, Las Vegas, Shanghai, Singapore."</w:t>
-      </w:r>
-    </w:p>
-    <w:p>
-      <w:pPr>
-        <w:pStyle w:val="Heading3"/>
-        <w:spacing w:after="100" w:before="240"/>
-      </w:pPr>
-      <w:r>
-        <w:t xml:space="preserve">Product and integration</w:t>
-      </w:r>
-    </w:p>
-    <w:p>
-      <w:pPr>
-        <w:pStyle w:val="ListParagraph"/>
-        <w:numPr>
-          <w:ilvl w:val="0"/>
-          <w:numId w:val="2"/>
-        </w:numPr>
-        <w:spacing w:after="60"/>
-      </w:pPr>
-      <w:r>
-        <w:t xml:space="preserve">"Would you want Moncler visible on people, not just on boards? Think off-track wardrobe, travel wear, the paddock arrivals that get photographed every weekend. Is product integration like that interesting, or is this more about experiences and clients?"</w:t>
-      </w:r>
-    </w:p>
-    <w:p>
-      <w:pPr>
-        <w:pStyle w:val="Heading3"/>
-        <w:spacing w:after="100" w:before="240"/>
-      </w:pPr>
-      <w:r>
-        <w:t xml:space="preserve">Budget and timing</w:t>
-      </w:r>
-    </w:p>
-    <w:p>
-      <w:pPr>
-        <w:pStyle w:val="ListParagraph"/>
-        <w:numPr>
-          <w:ilvl w:val="0"/>
-          <w:numId w:val="2"/>
-        </w:numPr>
-        <w:spacing w:after="60"/>
-      </w:pPr>
-      <w:r>
-        <w:t xml:space="preserve">"Have you set a budget range for this? Even a rough range helps me filter what is realistic."</w:t>
-      </w:r>
-    </w:p>
-    <w:p>
-      <w:pPr>
-        <w:pStyle w:val="ListParagraph"/>
-        <w:numPr>
-          <w:ilvl w:val="0"/>
-          <w:numId w:val="2"/>
-        </w:numPr>
-        <w:spacing w:after="60"/>
-      </w:pPr>
-      <w:r>
-        <w:t xml:space="preserve">"When would you want to be live? Partnerships here usually run three to five seasons, though fashion collaborations can also start with a capsule."</w:t>
-      </w:r>
-    </w:p>
-    <w:p>
-      <w:pPr>
-        <w:pStyle w:val="Heading3"/>
-        <w:spacing w:after="100" w:before="240"/>
-      </w:pPr>
-      <w:r>
-        <w:t xml:space="preserve">Decision process</w:t>
-      </w:r>
-    </w:p>
-    <w:p>
-      <w:pPr>
-        <w:pStyle w:val="ListParagraph"/>
-        <w:numPr>
-          <w:ilvl w:val="0"/>
-          <w:numId w:val="2"/>
-        </w:numPr>
-        <w:spacing w:after="60"/>
-      </w:pPr>
-      <w:r>
-        <w:t xml:space="preserve">"Apart from you, who shapes this decision? Mr Ruffini's office, the board?"</w:t>
-      </w:r>
-    </w:p>
-    <w:p>
-      <w:pPr>
-        <w:pStyle w:val="Heading3"/>
-        <w:spacing w:after="100" w:before="240"/>
-      </w:pPr>
-      <w:r>
-        <w:t xml:space="preserve">Marketing context</w:t>
-      </w:r>
-    </w:p>
-    <w:p>
-      <w:pPr>
-        <w:pStyle w:val="ListParagraph"/>
-        <w:numPr>
-          <w:ilvl w:val="0"/>
-          <w:numId w:val="2"/>
-        </w:numPr>
-        <w:spacing w:after="60"/>
-      </w:pPr>
-      <w:r>
-        <w:t xml:space="preserve">"How would this sit next to Genius, the shows, the campaigns? Would F1 be a Genius chapter or its own pillar?"</w:t>
-      </w:r>
-    </w:p>
-    <w:p>
-      <w:pPr>
-        <w:pStyle w:val="ListParagraph"/>
-        <w:numPr>
-          <w:ilvl w:val="0"/>
-          <w:numId w:val="2"/>
-        </w:numPr>
-        <w:spacing w:after="60"/>
-      </w:pPr>
-      <w:r>
-        <w:t xml:space="preserve">"Do you have the team to activate at this scale, or would you want support there too?"</w:t>
-      </w:r>
-    </w:p>
-    <w:p>
-      <w:pPr>
-        <w:pStyle w:val="Heading3"/>
-        <w:spacing w:after="100" w:before="240"/>
-      </w:pPr>
-      <w:r>
-        <w:t xml:space="preserve">Clients and hospitality</w:t>
-      </w:r>
-    </w:p>
-    <w:p>
-      <w:pPr>
-        <w:pStyle w:val="ListParagraph"/>
-        <w:numPr>
-          <w:ilvl w:val="0"/>
-          <w:numId w:val="2"/>
-        </w:numPr>
-        <w:spacing w:after="60"/>
-      </w:pPr>
-      <w:r>
-        <w:t xml:space="preserve">"How central is clienteling for you? Would you want your top clients hosted at Monaco, Las Vegas, Milan week at Monza?"</w:t>
+        <w:t xml:space="preserve">[Bjorn, then Ellery, a line or two each. Then bring it back and open softly; their answer sets the depth for Part 4:]</w:t>
+      </w:r>
+    </w:p>
+    <w:p>
+      <w:pPr>
+        <w:pBdr>
+          <w:left w:val="single" w:color="1F3864" w:sz="18"/>
+        </w:pBdr>
+        <w:shd w:fill="F2F4F8" w:val="clear"/>
+        <w:spacing w:after="160" w:before="80" w:line="264"/>
+        <w:ind w:left="280" w:right="120"/>
+      </w:pPr>
+      <w:r>
+        <w:t xml:space="preserve">"Great. And now, most importantly, we would love to hear from you. Tell us about Moncler. And let me start simple: how much do you follow Formula 1? And has Moncler looked at sport before, beyond ski?"</w:t>
+      </w:r>
+    </w:p>
+    <w:p>
+      <w:pPr>
+        <w:pStyle w:val="Heading1"/>
+        <w:spacing w:after="160" w:before="360"/>
+      </w:pPr>
+      <w:r>
+        <w:t xml:space="preserve">Part 3: The brief. Key discovery questions (12 to 15 minutes)</w:t>
       </w:r>
     </w:p>
     <w:p>
@@ -1499,29 +1297,270 @@
           <w:sz w:val="20"/>
           <w:szCs w:val="20"/>
         </w:rPr>
-        <w:t xml:space="preserve">[If they hesitate on the budget question:]</w:t>
-      </w:r>
-    </w:p>
-    <w:p>
-      <w:pPr>
-        <w:pBdr>
-          <w:left w:val="single" w:color="1F3864" w:sz="18"/>
-        </w:pBdr>
-        <w:shd w:fill="F2F4F8" w:val="clear"/>
-        <w:spacing w:after="160" w:before="80" w:line="264"/>
-        <w:ind w:left="280" w:right="120"/>
-      </w:pPr>
-      <w:r>
-        <w:t xml:space="preserve">"No problem. You do not need a number today. When we come back with recommendations, we will show options at different levels, and you will see what each level buys."</w:t>
-      </w:r>
-    </w:p>
-    <w:p>
-      <w:pPr>
-        <w:pStyle w:val="Heading1"/>
-        <w:spacing w:after="160" w:before="360"/>
-      </w:pPr>
-      <w:r>
-        <w:t xml:space="preserve">Part 4: How Formula 1 partnerships work (8 to 10 minutes)</w:t>
+        <w:t xml:space="preserve">[Work through these as a conversation, not a checklist. Follow their energy. The bold labels are for you; the questions are for them. Capture answers, they become the brief.]</w:t>
+      </w:r>
+    </w:p>
+    <w:p>
+      <w:pPr>
+        <w:pStyle w:val="Heading3"/>
+        <w:spacing w:after="100" w:before="240"/>
+      </w:pPr>
+      <w:r>
+        <w:t xml:space="preserve">Objectives</w:t>
+      </w:r>
+    </w:p>
+    <w:p>
+      <w:pPr>
+        <w:pStyle w:val="ListParagraph"/>
+        <w:numPr>
+          <w:ilvl w:val="0"/>
+          <w:numId w:val="2"/>
+        </w:numPr>
+        <w:spacing w:after="60"/>
+      </w:pPr>
+      <w:r>
+        <w:t xml:space="preserve">"What would Formula 1 need to do for Moncler? New audiences, heat for the brand, a bigger stage in the US and Asia, or something else?"</w:t>
+      </w:r>
+    </w:p>
+    <w:p>
+      <w:pPr>
+        <w:pStyle w:val="ListParagraph"/>
+        <w:numPr>
+          <w:ilvl w:val="0"/>
+          <w:numId w:val="2"/>
+        </w:numPr>
+        <w:spacing w:after="60"/>
+      </w:pPr>
+      <w:r>
+        <w:t xml:space="preserve">"Imagine this works perfectly. Three years from now, what has changed for Moncler because of it?"</w:t>
+      </w:r>
+    </w:p>
+    <w:p>
+      <w:pPr>
+        <w:pStyle w:val="Heading3"/>
+        <w:spacing w:after="100" w:before="240"/>
+      </w:pPr>
+      <w:r>
+        <w:t xml:space="preserve">Brand fit</w:t>
+      </w:r>
+    </w:p>
+    <w:p>
+      <w:pPr>
+        <w:pStyle w:val="ListParagraph"/>
+        <w:numPr>
+          <w:ilvl w:val="0"/>
+          <w:numId w:val="2"/>
+        </w:numPr>
+        <w:spacing w:after="60"/>
+      </w:pPr>
+      <w:r>
+        <w:t xml:space="preserve">"Moncler means the mountain, craft, and now co-creation through Genius. Which of those stories would you want Formula 1 to amplify?"</w:t>
+      </w:r>
+    </w:p>
+    <w:p>
+      <w:pPr>
+        <w:pStyle w:val="ListParagraph"/>
+        <w:numPr>
+          <w:ilvl w:val="0"/>
+          <w:numId w:val="2"/>
+        </w:numPr>
+        <w:spacing w:after="60"/>
+      </w:pPr>
+      <w:r>
+        <w:t xml:space="preserve">"Project Mondo G was a statement piece with Mercedes-Benz. Did that appetite for the automotive world continue inside the house?"</w:t>
+      </w:r>
+    </w:p>
+    <w:p>
+      <w:pPr>
+        <w:pStyle w:val="Heading3"/>
+        <w:spacing w:after="100" w:before="240"/>
+      </w:pPr>
+      <w:r>
+        <w:t xml:space="preserve">Audience</w:t>
+      </w:r>
+    </w:p>
+    <w:p>
+      <w:pPr>
+        <w:pStyle w:val="ListParagraph"/>
+        <w:numPr>
+          <w:ilvl w:val="0"/>
+          <w:numId w:val="2"/>
+        </w:numPr>
+        <w:spacing w:after="60"/>
+      </w:pPr>
+      <w:r>
+        <w:t xml:space="preserve">"Who is the customer you most want to win next: younger, more female, more American, more Asian?"</w:t>
+      </w:r>
+    </w:p>
+    <w:p>
+      <w:pPr>
+        <w:pStyle w:val="ListParagraph"/>
+        <w:numPr>
+          <w:ilvl w:val="0"/>
+          <w:numId w:val="2"/>
+        </w:numPr>
+        <w:spacing w:after="60"/>
+      </w:pPr>
+      <w:r>
+        <w:t xml:space="preserve">"How important is reaching new customers versus giving something special to your existing clients?"</w:t>
+      </w:r>
+    </w:p>
+    <w:p>
+      <w:pPr>
+        <w:pStyle w:val="Heading3"/>
+        <w:spacing w:after="100" w:before="240"/>
+      </w:pPr>
+      <w:r>
+        <w:t xml:space="preserve">Markets</w:t>
+      </w:r>
+    </w:p>
+    <w:p>
+      <w:pPr>
+        <w:pStyle w:val="ListParagraph"/>
+        <w:numPr>
+          <w:ilvl w:val="0"/>
+          <w:numId w:val="2"/>
+        </w:numPr>
+        <w:spacing w:after="60"/>
+      </w:pPr>
+      <w:r>
+        <w:t xml:space="preserve">"Which markets matter most for the next three years? The calendar covers all of them: Monaco, Miami, Las Vegas, Shanghai, Singapore."</w:t>
+      </w:r>
+    </w:p>
+    <w:p>
+      <w:pPr>
+        <w:pStyle w:val="Heading3"/>
+        <w:spacing w:after="100" w:before="240"/>
+      </w:pPr>
+      <w:r>
+        <w:t xml:space="preserve">Product and integration</w:t>
+      </w:r>
+    </w:p>
+    <w:p>
+      <w:pPr>
+        <w:pStyle w:val="ListParagraph"/>
+        <w:numPr>
+          <w:ilvl w:val="0"/>
+          <w:numId w:val="2"/>
+        </w:numPr>
+        <w:spacing w:after="60"/>
+      </w:pPr>
+      <w:r>
+        <w:t xml:space="preserve">"Would you want Moncler visible on people, not just on boards? Think off-track wardrobe, travel wear, the paddock arrivals that get photographed every weekend. Is product integration like that interesting, or is this more about experiences and clients?"</w:t>
+      </w:r>
+    </w:p>
+    <w:p>
+      <w:pPr>
+        <w:pStyle w:val="Heading3"/>
+        <w:spacing w:after="100" w:before="240"/>
+      </w:pPr>
+      <w:r>
+        <w:t xml:space="preserve">Budget and timing</w:t>
+      </w:r>
+    </w:p>
+    <w:p>
+      <w:pPr>
+        <w:pStyle w:val="ListParagraph"/>
+        <w:numPr>
+          <w:ilvl w:val="0"/>
+          <w:numId w:val="2"/>
+        </w:numPr>
+        <w:spacing w:after="60"/>
+      </w:pPr>
+      <w:r>
+        <w:t xml:space="preserve">"Have you set a budget range for this? Even a rough range helps me filter what is realistic."</w:t>
+      </w:r>
+    </w:p>
+    <w:p>
+      <w:pPr>
+        <w:pStyle w:val="ListParagraph"/>
+        <w:numPr>
+          <w:ilvl w:val="0"/>
+          <w:numId w:val="2"/>
+        </w:numPr>
+        <w:spacing w:after="60"/>
+      </w:pPr>
+      <w:r>
+        <w:t xml:space="preserve">"When would you want to be live? Partnerships here usually run three to five seasons, though fashion collaborations can also start with a capsule."</w:t>
+      </w:r>
+    </w:p>
+    <w:p>
+      <w:pPr>
+        <w:pStyle w:val="Heading3"/>
+        <w:spacing w:after="100" w:before="240"/>
+      </w:pPr>
+      <w:r>
+        <w:t xml:space="preserve">Decision process</w:t>
+      </w:r>
+    </w:p>
+    <w:p>
+      <w:pPr>
+        <w:pStyle w:val="ListParagraph"/>
+        <w:numPr>
+          <w:ilvl w:val="0"/>
+          <w:numId w:val="2"/>
+        </w:numPr>
+        <w:spacing w:after="60"/>
+      </w:pPr>
+      <w:r>
+        <w:t xml:space="preserve">"Apart from you, who shapes this decision? Mr Ruffini's office, the board?"</w:t>
+      </w:r>
+    </w:p>
+    <w:p>
+      <w:pPr>
+        <w:pStyle w:val="Heading3"/>
+        <w:spacing w:after="100" w:before="240"/>
+      </w:pPr>
+      <w:r>
+        <w:t xml:space="preserve">Marketing context</w:t>
+      </w:r>
+    </w:p>
+    <w:p>
+      <w:pPr>
+        <w:pStyle w:val="ListParagraph"/>
+        <w:numPr>
+          <w:ilvl w:val="0"/>
+          <w:numId w:val="2"/>
+        </w:numPr>
+        <w:spacing w:after="60"/>
+      </w:pPr>
+      <w:r>
+        <w:t xml:space="preserve">"How would this sit next to Genius, the shows, the campaigns? Would F1 be a Genius chapter or its own pillar?"</w:t>
+      </w:r>
+    </w:p>
+    <w:p>
+      <w:pPr>
+        <w:pStyle w:val="ListParagraph"/>
+        <w:numPr>
+          <w:ilvl w:val="0"/>
+          <w:numId w:val="2"/>
+        </w:numPr>
+        <w:spacing w:after="60"/>
+      </w:pPr>
+      <w:r>
+        <w:t xml:space="preserve">"Do you have the team to activate at this scale, or would you want support there too?"</w:t>
+      </w:r>
+    </w:p>
+    <w:p>
+      <w:pPr>
+        <w:pStyle w:val="Heading3"/>
+        <w:spacing w:after="100" w:before="240"/>
+      </w:pPr>
+      <w:r>
+        <w:t xml:space="preserve">Clients and hospitality</w:t>
+      </w:r>
+    </w:p>
+    <w:p>
+      <w:pPr>
+        <w:pStyle w:val="ListParagraph"/>
+        <w:numPr>
+          <w:ilvl w:val="0"/>
+          <w:numId w:val="2"/>
+        </w:numPr>
+        <w:spacing w:after="60"/>
+      </w:pPr>
+      <w:r>
+        <w:t xml:space="preserve">"How central is clienteling for you? Would you want your top clients hosted at Monaco, Las Vegas, Milan week at Monza?"</w:t>
       </w:r>
     </w:p>
     <w:p>
@@ -1536,253 +1575,29 @@
           <w:sz w:val="20"/>
           <w:szCs w:val="20"/>
         </w:rPr>
-        <w:t xml:space="preserve">[Calibrate to their answer from Part 2. If they know the sport, compress. Invite questions as you go: "Stop me anytime."]</w:t>
-      </w:r>
-    </w:p>
-    <w:p>
-      <w:pPr>
-        <w:pStyle w:val="Heading2"/>
-        <w:spacing w:after="120" w:before="280"/>
-      </w:pPr>
-      <w:r>
-        <w:t xml:space="preserve">4.1 The sport in thirty seconds</w:t>
-      </w:r>
-    </w:p>
-    <w:p>
-      <w:pPr>
-        <w:pBdr>
-          <w:left w:val="single" w:color="1F3864" w:sz="18"/>
-        </w:pBdr>
-        <w:shd w:fill="F2F4F8" w:val="clear"/>
-        <w:spacing w:after="60" w:before="80" w:line="264"/>
-        <w:ind w:left="280" w:right="120"/>
-      </w:pPr>
-      <w:r>
-        <w:t xml:space="preserve">"Let me give you a simple picture of how the sport is set up, because it explains the options you have.</w:t>
-      </w:r>
-    </w:p>
-    <w:p>
-      <w:pPr>
-        <w:pBdr>
-          <w:left w:val="single" w:color="1F3864" w:sz="18"/>
-        </w:pBdr>
-        <w:shd w:fill="F2F4F8" w:val="clear"/>
-        <w:spacing w:after="60" w:before="0" w:line="264"/>
-        <w:ind w:left="280" w:right="120"/>
-      </w:pPr>
-      <w:r>
-        <w:t xml:space="preserve">Formula 1 itself, the series, is owned by Liberty Media, an American media company. They own the commercial side: the calendar, the broadcast deals, the races.</w:t>
-      </w:r>
-    </w:p>
-    <w:p>
-      <w:pPr>
-        <w:pBdr>
-          <w:left w:val="single" w:color="1F3864" w:sz="18"/>
-        </w:pBdr>
-        <w:shd w:fill="F2F4F8" w:val="clear"/>
-        <w:spacing w:after="60" w:before="0" w:line="264"/>
-        <w:ind w:left="280" w:right="120"/>
-      </w:pPr>
-      <w:r>
-        <w:t xml:space="preserve">The FIA is the regulator. They write the rules.</w:t>
-      </w:r>
-    </w:p>
-    <w:p>
-      <w:pPr>
-        <w:pBdr>
-          <w:left w:val="single" w:color="1F3864" w:sz="18"/>
-        </w:pBdr>
-        <w:shd w:fill="F2F4F8" w:val="clear"/>
-        <w:spacing w:after="60" w:before="0" w:line="264"/>
-        <w:ind w:left="280" w:right="120"/>
-      </w:pPr>
-      <w:r>
-        <w:t xml:space="preserve">And then there are eleven teams. From this coming season it is eleven, including two American teams, Haas and Cadillac. Each team is an independent business with its own owners and its own partnerships. Some belong to car makers, like Ferrari, Mercedes and Audi. Some to consumer giants, like Red Bull. Some to investors.</w:t>
-      </w:r>
-    </w:p>
-    <w:p>
-      <w:pPr>
-        <w:pBdr>
-          <w:left w:val="single" w:color="1F3864" w:sz="18"/>
-        </w:pBdr>
-        <w:shd w:fill="F2F4F8" w:val="clear"/>
-        <w:spacing w:after="160" w:before="0" w:line="264"/>
-        <w:ind w:left="280" w:right="120"/>
-      </w:pPr>
-      <w:r>
-        <w:t xml:space="preserve">So a brand can partner at three levels: with the sport itself, with a team, or with a driver personally. Most brands enter through a team, and I can explain why when we get there."</w:t>
-      </w:r>
-    </w:p>
-    <w:p>
-      <w:pPr>
-        <w:pStyle w:val="Heading2"/>
-        <w:spacing w:after="120" w:before="280"/>
-      </w:pPr>
-      <w:r>
-        <w:t xml:space="preserve">4.2 What a team partnership includes</w:t>
-      </w:r>
-    </w:p>
-    <w:p>
-      <w:pPr>
-        <w:pBdr>
-          <w:left w:val="single" w:color="1F3864" w:sz="18"/>
-        </w:pBdr>
-        <w:shd w:fill="F2F4F8" w:val="clear"/>
-        <w:spacing w:after="60" w:before="80" w:line="264"/>
-        <w:ind w:left="280" w:right="120"/>
-      </w:pPr>
-      <w:r>
-        <w:t xml:space="preserve">"What do you get as a partner? Think of it in five parts.</w:t>
-      </w:r>
-    </w:p>
-    <w:p>
-      <w:pPr>
-        <w:pBdr>
-          <w:left w:val="single" w:color="1F3864" w:sz="18"/>
-        </w:pBdr>
-        <w:shd w:fill="F2F4F8" w:val="clear"/>
-        <w:spacing w:after="60" w:before="0" w:line="264"/>
-        <w:ind w:left="280" w:right="120"/>
-      </w:pPr>
-      <w:r>
-        <w:t xml:space="preserve"/>
-      </w:r>
-      <w:r>
-        <w:rPr>
-          <w:b/>
-          <w:bCs/>
-        </w:rPr>
-        <w:t xml:space="preserve">One, branding.</w:t>
-      </w:r>
-      <w:r>
-        <w:t xml:space="preserve"> Your logo on the car, on the drivers' race suits, on the garage. Around 24 race weekends a year, in front of a global TV audience. Last season the total audience was 1.8 billion, and the average race reached 76 million people.</w:t>
-      </w:r>
-    </w:p>
-    <w:p>
-      <w:pPr>
-        <w:pBdr>
-          <w:left w:val="single" w:color="1F3864" w:sz="18"/>
-        </w:pBdr>
-        <w:shd w:fill="F2F4F8" w:val="clear"/>
-        <w:spacing w:after="60" w:before="0" w:line="264"/>
-        <w:ind w:left="280" w:right="120"/>
-      </w:pPr>
-      <w:r>
-        <w:t xml:space="preserve"/>
-      </w:r>
-      <w:r>
-        <w:rPr>
-          <w:b/>
-          <w:bCs/>
-        </w:rPr>
-        <w:t xml:space="preserve">Two, the official title.</w:t>
-      </w:r>
-      <w:r>
-        <w:t xml:space="preserve"> You become, for example, the Official Luxury Apparel Partner of a team. You can use the team's name, logo and imagery in your own campaigns, your boutiques, your shows.</w:t>
-      </w:r>
-    </w:p>
-    <w:p>
-      <w:pPr>
-        <w:pBdr>
-          <w:left w:val="single" w:color="1F3864" w:sz="18"/>
-        </w:pBdr>
-        <w:shd w:fill="F2F4F8" w:val="clear"/>
-        <w:spacing w:after="60" w:before="0" w:line="264"/>
-        <w:ind w:left="280" w:right="120"/>
-      </w:pPr>
-      <w:r>
-        <w:t xml:space="preserve"/>
-      </w:r>
-      <w:r>
-        <w:rPr>
-          <w:b/>
-          <w:bCs/>
-        </w:rPr>
-        <w:t xml:space="preserve">Three, hospitality.</w:t>
-      </w:r>
-      <w:r>
-        <w:t xml:space="preserve"> This is where Formula 1 stands alone. Paddock access, the Paddock Club, garage tours, time with the drivers. Monaco, Las Vegas, Silverstone: rooms your clients cannot buy their way into.</w:t>
-      </w:r>
-    </w:p>
-    <w:p>
-      <w:pPr>
-        <w:pBdr>
-          <w:left w:val="single" w:color="1F3864" w:sz="18"/>
-        </w:pBdr>
-        <w:shd w:fill="F2F4F8" w:val="clear"/>
-        <w:spacing w:after="60" w:before="0" w:line="264"/>
-        <w:ind w:left="280" w:right="120"/>
-      </w:pPr>
-      <w:r>
-        <w:t xml:space="preserve">And one detail people miss. A Grand Prix runs over three days, and your passes work every day. So seven passes does not mean seven guests. You bring different clients on Friday, on Saturday, and on Sunday. Seven passes can host twenty different guests in one weekend, and hundreds across a season. For clienteling, very few platforms multiply like that.</w:t>
-      </w:r>
-    </w:p>
-    <w:p>
-      <w:pPr>
-        <w:pBdr>
-          <w:left w:val="single" w:color="1F3864" w:sz="18"/>
-        </w:pBdr>
-        <w:shd w:fill="F2F4F8" w:val="clear"/>
-        <w:spacing w:after="60" w:before="0" w:line="264"/>
-        <w:ind w:left="280" w:right="120"/>
-      </w:pPr>
-      <w:r>
-        <w:t xml:space="preserve"/>
-      </w:r>
-      <w:r>
-        <w:rPr>
-          <w:b/>
-          <w:bCs/>
-        </w:rPr>
-        <w:t xml:space="preserve">Four, content and digital.</w:t>
-      </w:r>
-      <w:r>
-        <w:t xml:space="preserve"> Access to the team's channels, the drivers, content made with you. Formula 1 is the number one sport in the world for social engagement, 2.2 billion engagements, ahead of the NBA.</w:t>
-      </w:r>
-    </w:p>
-    <w:p>
-      <w:pPr>
-        <w:pBdr>
-          <w:left w:val="single" w:color="1F3864" w:sz="18"/>
-        </w:pBdr>
-        <w:shd w:fill="F2F4F8" w:val="clear"/>
-        <w:spacing w:after="60" w:before="0" w:line="264"/>
-        <w:ind w:left="280" w:right="120"/>
-      </w:pPr>
-      <w:r>
-        <w:t xml:space="preserve"/>
-      </w:r>
-      <w:r>
-        <w:rPr>
-          <w:b/>
-          <w:bCs/>
-        </w:rPr>
-        <w:t xml:space="preserve">Five, people.</w:t>
-      </w:r>
-      <w:r>
-        <w:t xml:space="preserve"> The drivers themselves. Appearances at your shows and store openings, campaign shoots, and the paddock walk every single race weekend, which has become a fashion moment of its own.</w:t>
-      </w:r>
-    </w:p>
-    <w:p>
-      <w:pPr>
-        <w:pBdr>
-          <w:left w:val="single" w:color="1F3864" w:sz="18"/>
-        </w:pBdr>
-        <w:shd w:fill="F2F4F8" w:val="clear"/>
-        <w:spacing w:after="160" w:before="0" w:line="264"/>
-        <w:ind w:left="280" w:right="120"/>
-      </w:pPr>
-      <w:r>
-        <w:t xml:space="preserve">And around all of this sits a business platform: every team carries 25 or more partners, more than 350 companies across the grid, hosted together all season."</w:t>
-      </w:r>
-    </w:p>
-    <w:p>
-      <w:pPr>
-        <w:pStyle w:val="Heading2"/>
-        <w:spacing w:after="120" w:before="280"/>
-      </w:pPr>
-      <w:r>
-        <w:t xml:space="preserve">4.3 The audience</w:t>
+        <w:t xml:space="preserve">[If they hesitate on the budget question:]</w:t>
+      </w:r>
+    </w:p>
+    <w:p>
+      <w:pPr>
+        <w:pBdr>
+          <w:left w:val="single" w:color="1F3864" w:sz="18"/>
+        </w:pBdr>
+        <w:shd w:fill="F2F4F8" w:val="clear"/>
+        <w:spacing w:after="160" w:before="80" w:line="264"/>
+        <w:ind w:left="280" w:right="120"/>
+      </w:pPr>
+      <w:r>
+        <w:t xml:space="preserve">"No problem. You do not need a number today. When we come back with recommendations, we will show options at different levels, and you will see what each level buys."</w:t>
+      </w:r>
+    </w:p>
+    <w:p>
+      <w:pPr>
+        <w:pStyle w:val="Heading1"/>
+        <w:spacing w:after="160" w:before="360"/>
+      </w:pPr>
+      <w:r>
+        <w:t xml:space="preserve">Part 4: How Formula 1 partnerships work (8 to 10 minutes)</w:t>
       </w:r>
     </w:p>
     <w:p>
@@ -1797,85 +1612,7 @@
           <w:sz w:val="20"/>
           <w:szCs w:val="20"/>
         </w:rPr>
-        <w:t xml:space="preserve">[This is the B2C section. For Moncler, the audience is the argument.]</w:t>
-      </w:r>
-    </w:p>
-    <w:p>
-      <w:pPr>
-        <w:pBdr>
-          <w:left w:val="single" w:color="1F3864" w:sz="18"/>
-        </w:pBdr>
-        <w:shd w:fill="F2F4F8" w:val="clear"/>
-        <w:spacing w:after="60" w:before="80" w:line="264"/>
-        <w:ind w:left="280" w:right="120"/>
-      </w:pPr>
-      <w:r>
-        <w:t xml:space="preserve">"Now the part that matters most for a consumer brand: who is watching.</w:t>
-      </w:r>
-    </w:p>
-    <w:p>
-      <w:pPr>
-        <w:pBdr>
-          <w:left w:val="single" w:color="1F3864" w:sz="18"/>
-        </w:pBdr>
-        <w:shd w:fill="F2F4F8" w:val="clear"/>
-        <w:spacing w:after="60" w:before="0" w:line="264"/>
-        <w:ind w:left="280" w:right="120"/>
-      </w:pPr>
-      <w:r>
-        <w:t xml:space="preserve">Formula 1 has 827 million fans, and the base has grown 63% since 2018. But the story is who the new fans are.</w:t>
-      </w:r>
-    </w:p>
-    <w:p>
-      <w:pPr>
-        <w:pBdr>
-          <w:left w:val="single" w:color="1F3864" w:sz="18"/>
-        </w:pBdr>
-        <w:shd w:fill="F2F4F8" w:val="clear"/>
-        <w:spacing w:after="60" w:before="0" w:line="264"/>
-        <w:ind w:left="280" w:right="120"/>
-      </w:pPr>
-      <w:r>
-        <w:t xml:space="preserve">42% of fans are women, up from 37% in 2018, and in the sport's own survey, three out of four new fans are women. 43% of all fans are under 35, and the average age keeps falling. This is not the old motorsport crowd. This is young, digital, and increasingly female.</w:t>
-      </w:r>
-    </w:p>
-    <w:p>
-      <w:pPr>
-        <w:pBdr>
-          <w:left w:val="single" w:color="1F3864" w:sz="18"/>
-        </w:pBdr>
-        <w:shd w:fill="F2F4F8" w:val="clear"/>
-        <w:spacing w:after="60" w:before="0" w:line="264"/>
-        <w:ind w:left="280" w:right="120"/>
-      </w:pPr>
-      <w:r>
-        <w:t xml:space="preserve">And they behave like luxury customers. F1 fans index higher than any other sport's fans for buying premium versions of products. They are joint first for high income. And they are the most brand-loyal fans in sport, twice the loyalty of the average consumer.</w:t>
-      </w:r>
-    </w:p>
-    <w:p>
-      <w:pPr>
-        <w:pBdr>
-          <w:left w:val="single" w:color="1F3864" w:sz="18"/>
-        </w:pBdr>
-        <w:shd w:fill="F2F4F8" w:val="clear"/>
-        <w:spacing w:after="60" w:before="0" w:line="264"/>
-        <w:ind w:left="280" w:right="120"/>
-      </w:pPr>
-      <w:r>
-        <w:t xml:space="preserve">Sponsorship moves them too: in the US, fans are 32% more likely to consider a sponsor's product. Among women it is 41%, among Gen Z 39%.</w:t>
-      </w:r>
-    </w:p>
-    <w:p>
-      <w:pPr>
-        <w:pBdr>
-          <w:left w:val="single" w:color="1F3864" w:sz="18"/>
-        </w:pBdr>
-        <w:shd w:fill="F2F4F8" w:val="clear"/>
-        <w:spacing w:after="160" w:before="0" w:line="264"/>
-        <w:ind w:left="280" w:right="120"/>
-      </w:pPr>
-      <w:r>
-        <w:t xml:space="preserve">In short: the customer luxury is chasing for the next decade is already sitting in these grandstands."</w:t>
+        <w:t xml:space="preserve">[Calibrate to their answer from Part 2. If they know the sport, compress. Invite questions as you go: "Stop me anytime."]</w:t>
       </w:r>
     </w:p>
     <w:p>
@@ -1884,7 +1621,7 @@
         <w:spacing w:after="120" w:before="280"/>
       </w:pPr>
       <w:r>
-        <w:t xml:space="preserve">4.4 Why this could fit Moncler</w:t>
+        <w:t xml:space="preserve">4.1 The sport in thirty seconds</w:t>
       </w:r>
     </w:p>
     <w:p>
@@ -1897,76 +1634,46 @@
         <w:ind w:left="280" w:right="120"/>
       </w:pPr>
       <w:r>
-        <w:t xml:space="preserve">"Let me tell you why I find this interesting for Moncler. Three reasons.</w:t>
-      </w:r>
-    </w:p>
-    <w:p>
-      <w:pPr>
-        <w:pBdr>
-          <w:left w:val="single" w:color="1F3864" w:sz="18"/>
-        </w:pBdr>
-        <w:shd w:fill="F2F4F8" w:val="clear"/>
-        <w:spacing w:after="60" w:before="0" w:line="264"/>
-        <w:ind w:left="280" w:right="120"/>
-      </w:pPr>
-      <w:r>
-        <w:t xml:space="preserve"/>
-      </w:r>
-      <w:r>
-        <w:rPr>
-          <w:b/>
-          <w:bCs/>
-        </w:rPr>
-        <w:t xml:space="preserve">First, luxury has already made its move.</w:t>
-      </w:r>
-      <w:r>
-        <w:t xml:space="preserve"> The biggest luxury group in the world put Louis Vuitton on Monaco, TAG Heuer on Madrid, and Moet on the podium. At team level, Brioni dresses Alpine, Tommy Hilfiger is with Cadillac, Hugo Boss with Racing Bulls. Fashion is not testing Formula 1 anymore. It is settling in. The question is which houses get the remaining seats.</w:t>
-      </w:r>
-    </w:p>
-    <w:p>
-      <w:pPr>
-        <w:pBdr>
-          <w:left w:val="single" w:color="1F3864" w:sz="18"/>
-        </w:pBdr>
-        <w:shd w:fill="F2F4F8" w:val="clear"/>
-        <w:spacing w:after="60" w:before="0" w:line="264"/>
-        <w:ind w:left="280" w:right="120"/>
-      </w:pPr>
-      <w:r>
-        <w:t xml:space="preserve"/>
-      </w:r>
-      <w:r>
-        <w:rPr>
-          <w:b/>
-          <w:bCs/>
-        </w:rPr>
-        <w:t xml:space="preserve">Second, the white space fits you.</w:t>
-      </w:r>
-      <w:r>
-        <w:t xml:space="preserve"> Every team's technical racewear is held by sportswear brands: Puma, adidas, Castore. That is not your fight. The space next to it, what the team wears off track, how the drivers arrive, what the paddock looks like on camera, that is a luxury space, and it is exactly where Moncler lives. The paddock walk is photographed every weekend of the season. It is a runway that happens 24 times a year.</w:t>
-      </w:r>
-    </w:p>
-    <w:p>
-      <w:pPr>
-        <w:pBdr>
-          <w:left w:val="single" w:color="1F3864" w:sz="18"/>
-        </w:pBdr>
-        <w:shd w:fill="F2F4F8" w:val="clear"/>
-        <w:spacing w:after="60" w:before="0" w:line="264"/>
-        <w:ind w:left="280" w:right="120"/>
-      </w:pPr>
-      <w:r>
-        <w:t xml:space="preserve"/>
-      </w:r>
-      <w:r>
-        <w:rPr>
-          <w:b/>
-          <w:bCs/>
-        </w:rPr>
-        <w:t xml:space="preserve">Third, the stages themselves.</w:t>
-      </w:r>
-      <w:r>
-        <w:t xml:space="preserve"> Monaco. Las Vegas at night, in the desert cold, where half the paddock already wears puffer jackets. Miami. Monza, an hour from your Milan headquarters. These are the most glamorous nights in sport, and a partner owns a piece of them.</w:t>
+        <w:t xml:space="preserve">"Let me give you a simple picture of how the sport is set up, because it explains the options you have.</w:t>
+      </w:r>
+    </w:p>
+    <w:p>
+      <w:pPr>
+        <w:pBdr>
+          <w:left w:val="single" w:color="1F3864" w:sz="18"/>
+        </w:pBdr>
+        <w:shd w:fill="F2F4F8" w:val="clear"/>
+        <w:spacing w:after="60" w:before="0" w:line="264"/>
+        <w:ind w:left="280" w:right="120"/>
+      </w:pPr>
+      <w:r>
+        <w:t xml:space="preserve">Formula 1 itself, the series, is owned by Liberty Media, an American media company. They own the commercial side: the calendar, the broadcast deals, the races.</w:t>
+      </w:r>
+    </w:p>
+    <w:p>
+      <w:pPr>
+        <w:pBdr>
+          <w:left w:val="single" w:color="1F3864" w:sz="18"/>
+        </w:pBdr>
+        <w:shd w:fill="F2F4F8" w:val="clear"/>
+        <w:spacing w:after="60" w:before="0" w:line="264"/>
+        <w:ind w:left="280" w:right="120"/>
+      </w:pPr>
+      <w:r>
+        <w:t xml:space="preserve">The FIA is the regulator. They write the rules.</w:t>
+      </w:r>
+    </w:p>
+    <w:p>
+      <w:pPr>
+        <w:pBdr>
+          <w:left w:val="single" w:color="1F3864" w:sz="18"/>
+        </w:pBdr>
+        <w:shd w:fill="F2F4F8" w:val="clear"/>
+        <w:spacing w:after="60" w:before="0" w:line="264"/>
+        <w:ind w:left="280" w:right="120"/>
+      </w:pPr>
+      <w:r>
+        <w:t xml:space="preserve">And then there are eleven teams. From this coming season it is eleven, including two American teams, Haas and Cadillac. Each team is an independent business with its own owners and its own partnerships. Some belong to car makers, like Ferrari, Mercedes and Audi. Some to consumer giants, like Red Bull. Some to investors.</w:t>
       </w:r>
     </w:p>
     <w:p>
@@ -1979,7 +1686,7 @@
         <w:ind w:left="280" w:right="120"/>
       </w:pPr>
       <w:r>
-        <w:t xml:space="preserve">One last thing on value. All of this sits on very small supply. Eleven teams for the entire world, one seat per category, deals of three to five years. Small supply, growing demand. That is why these partnerships hold their value."</w:t>
+        <w:t xml:space="preserve">So a brand can partner at three levels: with the sport itself, with a team, or with a driver personally. Most brands enter through a team, and I can explain why when we get there."</w:t>
       </w:r>
     </w:p>
     <w:p>
@@ -1988,7 +1695,170 @@
         <w:spacing w:after="120" w:before="280"/>
       </w:pPr>
       <w:r>
-        <w:t xml:space="preserve">4.5 Three activation ideas (examples, not proposals)</w:t>
+        <w:t xml:space="preserve">4.2 What a team partnership includes</w:t>
+      </w:r>
+    </w:p>
+    <w:p>
+      <w:pPr>
+        <w:pBdr>
+          <w:left w:val="single" w:color="1F3864" w:sz="18"/>
+        </w:pBdr>
+        <w:shd w:fill="F2F4F8" w:val="clear"/>
+        <w:spacing w:after="60" w:before="80" w:line="264"/>
+        <w:ind w:left="280" w:right="120"/>
+      </w:pPr>
+      <w:r>
+        <w:t xml:space="preserve">"What do you get as a partner? Think of it in five parts.</w:t>
+      </w:r>
+    </w:p>
+    <w:p>
+      <w:pPr>
+        <w:pBdr>
+          <w:left w:val="single" w:color="1F3864" w:sz="18"/>
+        </w:pBdr>
+        <w:shd w:fill="F2F4F8" w:val="clear"/>
+        <w:spacing w:after="60" w:before="0" w:line="264"/>
+        <w:ind w:left="280" w:right="120"/>
+      </w:pPr>
+      <w:r>
+        <w:t xml:space="preserve"/>
+      </w:r>
+      <w:r>
+        <w:rPr>
+          <w:b/>
+          <w:bCs/>
+        </w:rPr>
+        <w:t xml:space="preserve">One, branding.</w:t>
+      </w:r>
+      <w:r>
+        <w:t xml:space="preserve"> Your logo on the car, on the drivers' race suits, on the garage. Around 24 race weekends a year, in front of a global TV audience. Last season the total audience was 1.8 billion, and the average race reached 76 million people.</w:t>
+      </w:r>
+    </w:p>
+    <w:p>
+      <w:pPr>
+        <w:pBdr>
+          <w:left w:val="single" w:color="1F3864" w:sz="18"/>
+        </w:pBdr>
+        <w:shd w:fill="F2F4F8" w:val="clear"/>
+        <w:spacing w:after="60" w:before="0" w:line="264"/>
+        <w:ind w:left="280" w:right="120"/>
+      </w:pPr>
+      <w:r>
+        <w:t xml:space="preserve"/>
+      </w:r>
+      <w:r>
+        <w:rPr>
+          <w:b/>
+          <w:bCs/>
+        </w:rPr>
+        <w:t xml:space="preserve">Two, the official title.</w:t>
+      </w:r>
+      <w:r>
+        <w:t xml:space="preserve"> You become, for example, the Official Luxury Apparel Partner of a team. You can use the team's name, logo and imagery in your own campaigns, your boutiques, your shows.</w:t>
+      </w:r>
+    </w:p>
+    <w:p>
+      <w:pPr>
+        <w:pBdr>
+          <w:left w:val="single" w:color="1F3864" w:sz="18"/>
+        </w:pBdr>
+        <w:shd w:fill="F2F4F8" w:val="clear"/>
+        <w:spacing w:after="60" w:before="0" w:line="264"/>
+        <w:ind w:left="280" w:right="120"/>
+      </w:pPr>
+      <w:r>
+        <w:t xml:space="preserve"/>
+      </w:r>
+      <w:r>
+        <w:rPr>
+          <w:b/>
+          <w:bCs/>
+        </w:rPr>
+        <w:t xml:space="preserve">Three, hospitality.</w:t>
+      </w:r>
+      <w:r>
+        <w:t xml:space="preserve"> This is where Formula 1 stands alone. Paddock access, the Paddock Club, garage tours, time with the drivers. Monaco, Las Vegas, Silverstone: rooms your clients cannot buy their way into.</w:t>
+      </w:r>
+    </w:p>
+    <w:p>
+      <w:pPr>
+        <w:pBdr>
+          <w:left w:val="single" w:color="1F3864" w:sz="18"/>
+        </w:pBdr>
+        <w:shd w:fill="F2F4F8" w:val="clear"/>
+        <w:spacing w:after="60" w:before="0" w:line="264"/>
+        <w:ind w:left="280" w:right="120"/>
+      </w:pPr>
+      <w:r>
+        <w:t xml:space="preserve">And one detail people miss. A Grand Prix runs over three days, and your passes work every day. So seven passes does not mean seven guests. You bring different clients on Friday, on Saturday, and on Sunday. Seven passes can host twenty different guests in one weekend, and hundreds across a season. For clienteling, very few platforms multiply like that.</w:t>
+      </w:r>
+    </w:p>
+    <w:p>
+      <w:pPr>
+        <w:pBdr>
+          <w:left w:val="single" w:color="1F3864" w:sz="18"/>
+        </w:pBdr>
+        <w:shd w:fill="F2F4F8" w:val="clear"/>
+        <w:spacing w:after="60" w:before="0" w:line="264"/>
+        <w:ind w:left="280" w:right="120"/>
+      </w:pPr>
+      <w:r>
+        <w:t xml:space="preserve"/>
+      </w:r>
+      <w:r>
+        <w:rPr>
+          <w:b/>
+          <w:bCs/>
+        </w:rPr>
+        <w:t xml:space="preserve">Four, content and digital.</w:t>
+      </w:r>
+      <w:r>
+        <w:t xml:space="preserve"> Access to the team's channels, the drivers, content made with you. Formula 1 is the number one sport in the world for social engagement, 2.2 billion engagements, ahead of the NBA.</w:t>
+      </w:r>
+    </w:p>
+    <w:p>
+      <w:pPr>
+        <w:pBdr>
+          <w:left w:val="single" w:color="1F3864" w:sz="18"/>
+        </w:pBdr>
+        <w:shd w:fill="F2F4F8" w:val="clear"/>
+        <w:spacing w:after="60" w:before="0" w:line="264"/>
+        <w:ind w:left="280" w:right="120"/>
+      </w:pPr>
+      <w:r>
+        <w:t xml:space="preserve"/>
+      </w:r>
+      <w:r>
+        <w:rPr>
+          <w:b/>
+          <w:bCs/>
+        </w:rPr>
+        <w:t xml:space="preserve">Five, people.</w:t>
+      </w:r>
+      <w:r>
+        <w:t xml:space="preserve"> The drivers themselves. Appearances at your shows and store openings, campaign shoots, and the paddock walk every single race weekend, which has become a fashion moment of its own.</w:t>
+      </w:r>
+    </w:p>
+    <w:p>
+      <w:pPr>
+        <w:pBdr>
+          <w:left w:val="single" w:color="1F3864" w:sz="18"/>
+        </w:pBdr>
+        <w:shd w:fill="F2F4F8" w:val="clear"/>
+        <w:spacing w:after="160" w:before="0" w:line="264"/>
+        <w:ind w:left="280" w:right="120"/>
+      </w:pPr>
+      <w:r>
+        <w:t xml:space="preserve">And around all of this sits a business platform: every team carries 25 or more partners, more than 350 companies across the grid, hosted together all season."</w:t>
+      </w:r>
+    </w:p>
+    <w:p>
+      <w:pPr>
+        <w:pStyle w:val="Heading2"/>
+        <w:spacing w:after="120" w:before="280"/>
+      </w:pPr>
+      <w:r>
+        <w:t xml:space="preserve">4.3 The audience</w:t>
       </w:r>
     </w:p>
     <w:p>
@@ -2003,7 +1873,7 @@
           <w:sz w:val="20"/>
           <w:szCs w:val="20"/>
         </w:rPr>
-        <w:t xml:space="preserve">[Offer these as sketches to make it concrete. Let them react; their reaction feeds the brief.]</w:t>
+        <w:t xml:space="preserve">[This is the B2C section. For Moncler, the audience is the argument.]</w:t>
       </w:r>
     </w:p>
     <w:p>
@@ -2016,7 +1886,94 @@
         <w:ind w:left="280" w:right="120"/>
       </w:pPr>
       <w:r>
-        <w:t xml:space="preserve">"To make this concrete, let me sketch three ways a house like Moncler could show up. Early thoughts, nothing more.</w:t>
+        <w:t xml:space="preserve">"Now the part that matters most for a consumer brand: who is watching.</w:t>
+      </w:r>
+    </w:p>
+    <w:p>
+      <w:pPr>
+        <w:pBdr>
+          <w:left w:val="single" w:color="1F3864" w:sz="18"/>
+        </w:pBdr>
+        <w:shd w:fill="F2F4F8" w:val="clear"/>
+        <w:spacing w:after="60" w:before="0" w:line="264"/>
+        <w:ind w:left="280" w:right="120"/>
+      </w:pPr>
+      <w:r>
+        <w:t xml:space="preserve">Formula 1 has 827 million fans, and the base has grown 63% since 2018. But the story is who the new fans are.</w:t>
+      </w:r>
+    </w:p>
+    <w:p>
+      <w:pPr>
+        <w:pBdr>
+          <w:left w:val="single" w:color="1F3864" w:sz="18"/>
+        </w:pBdr>
+        <w:shd w:fill="F2F4F8" w:val="clear"/>
+        <w:spacing w:after="60" w:before="0" w:line="264"/>
+        <w:ind w:left="280" w:right="120"/>
+      </w:pPr>
+      <w:r>
+        <w:t xml:space="preserve">42% of fans are women, up from 37% in 2018, and in the sport's own survey, three out of four new fans are women. 43% of all fans are under 35, and the average age keeps falling. This is not the old motorsport crowd. This is young, digital, and increasingly female.</w:t>
+      </w:r>
+    </w:p>
+    <w:p>
+      <w:pPr>
+        <w:pBdr>
+          <w:left w:val="single" w:color="1F3864" w:sz="18"/>
+        </w:pBdr>
+        <w:shd w:fill="F2F4F8" w:val="clear"/>
+        <w:spacing w:after="60" w:before="0" w:line="264"/>
+        <w:ind w:left="280" w:right="120"/>
+      </w:pPr>
+      <w:r>
+        <w:t xml:space="preserve">And they behave like luxury customers. F1 fans index higher than any other sport's fans for buying premium versions of products. They are joint first for high income. And they are the most brand-loyal fans in sport, twice the loyalty of the average consumer.</w:t>
+      </w:r>
+    </w:p>
+    <w:p>
+      <w:pPr>
+        <w:pBdr>
+          <w:left w:val="single" w:color="1F3864" w:sz="18"/>
+        </w:pBdr>
+        <w:shd w:fill="F2F4F8" w:val="clear"/>
+        <w:spacing w:after="60" w:before="0" w:line="264"/>
+        <w:ind w:left="280" w:right="120"/>
+      </w:pPr>
+      <w:r>
+        <w:t xml:space="preserve">Sponsorship moves them too: in the US, fans are 32% more likely to consider a sponsor's product. Among women it is 41%, among Gen Z 39%.</w:t>
+      </w:r>
+    </w:p>
+    <w:p>
+      <w:pPr>
+        <w:pBdr>
+          <w:left w:val="single" w:color="1F3864" w:sz="18"/>
+        </w:pBdr>
+        <w:shd w:fill="F2F4F8" w:val="clear"/>
+        <w:spacing w:after="160" w:before="0" w:line="264"/>
+        <w:ind w:left="280" w:right="120"/>
+      </w:pPr>
+      <w:r>
+        <w:t xml:space="preserve">In short: the customer luxury is chasing for the next decade is already sitting in these grandstands."</w:t>
+      </w:r>
+    </w:p>
+    <w:p>
+      <w:pPr>
+        <w:pStyle w:val="Heading2"/>
+        <w:spacing w:after="120" w:before="280"/>
+      </w:pPr>
+      <w:r>
+        <w:t xml:space="preserve">4.4 Why this could fit Moncler</w:t>
+      </w:r>
+    </w:p>
+    <w:p>
+      <w:pPr>
+        <w:pBdr>
+          <w:left w:val="single" w:color="1F3864" w:sz="18"/>
+        </w:pBdr>
+        <w:shd w:fill="F2F4F8" w:val="clear"/>
+        <w:spacing w:after="60" w:before="80" w:line="264"/>
+        <w:ind w:left="280" w:right="120"/>
+      </w:pPr>
+      <w:r>
+        <w:t xml:space="preserve">"Let me tell you why I find this interesting for Moncler. Three reasons.</w:t>
       </w:r>
     </w:p>
     <w:p>
@@ -2036,10 +1993,10 @@
           <w:b/>
           <w:bCs/>
         </w:rPr>
-        <w:t xml:space="preserve">One, the capsule.</w:t>
-      </w:r>
-      <w:r>
-        <w:t xml:space="preserve"> A limited Moncler collection with a team, in the team's colors, launched in race week and sold through your boutiques and the team's store. You have run this play through Genius many times, and Project Mondo G shows how far it can go. Formula 1 gives it 24 global stages a year.</w:t>
+        <w:t xml:space="preserve">First, luxury has already made its move.</w:t>
+      </w:r>
+      <w:r>
+        <w:t xml:space="preserve"> The biggest luxury group in the world put Louis Vuitton on Monaco, TAG Heuer on Madrid, and Moet on the podium. At team level, Brioni dresses Alpine, Tommy Hilfiger is with Cadillac, Hugo Boss with Racing Bulls. Fashion is not testing Formula 1 anymore. It is settling in. The question is which houses get the remaining seats.</w:t>
       </w:r>
     </w:p>
     <w:p>
@@ -2059,10 +2016,33 @@
           <w:b/>
           <w:bCs/>
         </w:rPr>
-        <w:t xml:space="preserve">Two, the wardrobe.</w:t>
-      </w:r>
-      <w:r>
-        <w:t xml:space="preserve"> Moncler dresses the team off track: the travel wardrobe, the arrivals, the cold races. Brioni does the formal version with Alpine. Nobody owns the luxury outerwear version yet, and the paddock in Las Vegas at midnight is the most natural Moncler picture in world sport.</w:t>
+        <w:t xml:space="preserve">Second, the white space fits you.</w:t>
+      </w:r>
+      <w:r>
+        <w:t xml:space="preserve"> Every team's technical racewear is held by sportswear brands: Puma, adidas, Castore. That is not your fight. The space next to it, what the team wears off track, how the drivers arrive, what the paddock looks like on camera, that is a luxury space, and it is exactly where Moncler lives. The paddock walk is photographed every weekend of the season. It is a runway that happens 24 times a year.</w:t>
+      </w:r>
+    </w:p>
+    <w:p>
+      <w:pPr>
+        <w:pBdr>
+          <w:left w:val="single" w:color="1F3864" w:sz="18"/>
+        </w:pBdr>
+        <w:shd w:fill="F2F4F8" w:val="clear"/>
+        <w:spacing w:after="60" w:before="0" w:line="264"/>
+        <w:ind w:left="280" w:right="120"/>
+      </w:pPr>
+      <w:r>
+        <w:t xml:space="preserve"/>
+      </w:r>
+      <w:r>
+        <w:rPr>
+          <w:b/>
+          <w:bCs/>
+        </w:rPr>
+        <w:t xml:space="preserve">Third, the stages themselves.</w:t>
+      </w:r>
+      <w:r>
+        <w:t xml:space="preserve"> Monaco. Las Vegas at night, in the desert cold, where half the paddock already wears puffer jackets. Miami. Monza, an hour from your Milan headquarters. These are the most glamorous nights in sport, and a partner owns a piece of them.</w:t>
       </w:r>
     </w:p>
     <w:p>
@@ -2075,31 +2055,16 @@
         <w:ind w:left="280" w:right="120"/>
       </w:pPr>
       <w:r>
-        <w:t xml:space="preserve"/>
-      </w:r>
-      <w:r>
-        <w:rPr>
-          <w:b/>
-          <w:bCs/>
-        </w:rPr>
-        <w:t xml:space="preserve">Three, the clients.</w:t>
-      </w:r>
-      <w:r>
-        <w:t xml:space="preserve"> A Moncler hospitality program: your top clients hosted across the season, Monaco, Monza, Las Vegas, with the paddock, the garage and the drivers as the experience. Twenty guests per weekend from seven passes. Money cannot buy the access. A Moncler client card can."</w:t>
-      </w:r>
-    </w:p>
-    <w:p>
-      <w:r>
-        <w:br w:type="page"/>
-      </w:r>
-    </w:p>
-    <w:p>
-      <w:pPr>
-        <w:pStyle w:val="Heading1"/>
-        <w:spacing w:after="160" w:before="360"/>
-      </w:pPr>
-      <w:r>
-        <w:t xml:space="preserve">Part 5: Questions they may ask. Prepared answers.</w:t>
+        <w:t xml:space="preserve">One last thing on value. All of this sits on very small supply. Eleven teams for the entire world, one seat per category, deals of three to five years. Small supply, growing demand. That is why these partnerships hold their value."</w:t>
+      </w:r>
+    </w:p>
+    <w:p>
+      <w:pPr>
+        <w:pStyle w:val="Heading2"/>
+        <w:spacing w:after="120" w:before="280"/>
+      </w:pPr>
+      <w:r>
+        <w:t xml:space="preserve">4.5 Three activation ideas (examples, not proposals)</w:t>
       </w:r>
     </w:p>
     <w:p>
@@ -2114,6 +2079,117 @@
           <w:sz w:val="20"/>
           <w:szCs w:val="20"/>
         </w:rPr>
+        <w:t xml:space="preserve">[Offer these as sketches to make it concrete. Let them react; their reaction feeds the brief.]</w:t>
+      </w:r>
+    </w:p>
+    <w:p>
+      <w:pPr>
+        <w:pBdr>
+          <w:left w:val="single" w:color="1F3864" w:sz="18"/>
+        </w:pBdr>
+        <w:shd w:fill="F2F4F8" w:val="clear"/>
+        <w:spacing w:after="60" w:before="80" w:line="264"/>
+        <w:ind w:left="280" w:right="120"/>
+      </w:pPr>
+      <w:r>
+        <w:t xml:space="preserve">"To make this concrete, let me sketch three ways a house like Moncler could show up. Early thoughts, nothing more.</w:t>
+      </w:r>
+    </w:p>
+    <w:p>
+      <w:pPr>
+        <w:pBdr>
+          <w:left w:val="single" w:color="1F3864" w:sz="18"/>
+        </w:pBdr>
+        <w:shd w:fill="F2F4F8" w:val="clear"/>
+        <w:spacing w:after="60" w:before="0" w:line="264"/>
+        <w:ind w:left="280" w:right="120"/>
+      </w:pPr>
+      <w:r>
+        <w:t xml:space="preserve"/>
+      </w:r>
+      <w:r>
+        <w:rPr>
+          <w:b/>
+          <w:bCs/>
+        </w:rPr>
+        <w:t xml:space="preserve">One, the capsule.</w:t>
+      </w:r>
+      <w:r>
+        <w:t xml:space="preserve"> A limited Moncler collection with a team, in the team's colors, launched in race week and sold through your boutiques and the team's store. You have run this play through Genius many times, and Project Mondo G shows how far it can go. Formula 1 gives it 24 global stages a year.</w:t>
+      </w:r>
+    </w:p>
+    <w:p>
+      <w:pPr>
+        <w:pBdr>
+          <w:left w:val="single" w:color="1F3864" w:sz="18"/>
+        </w:pBdr>
+        <w:shd w:fill="F2F4F8" w:val="clear"/>
+        <w:spacing w:after="60" w:before="0" w:line="264"/>
+        <w:ind w:left="280" w:right="120"/>
+      </w:pPr>
+      <w:r>
+        <w:t xml:space="preserve"/>
+      </w:r>
+      <w:r>
+        <w:rPr>
+          <w:b/>
+          <w:bCs/>
+        </w:rPr>
+        <w:t xml:space="preserve">Two, the wardrobe.</w:t>
+      </w:r>
+      <w:r>
+        <w:t xml:space="preserve"> Moncler dresses the team off track: the travel wardrobe, the arrivals, the cold races. Brioni does the formal version with Alpine. Nobody owns the luxury outerwear version yet, and the paddock in Las Vegas at midnight is the most natural Moncler picture in world sport.</w:t>
+      </w:r>
+    </w:p>
+    <w:p>
+      <w:pPr>
+        <w:pBdr>
+          <w:left w:val="single" w:color="1F3864" w:sz="18"/>
+        </w:pBdr>
+        <w:shd w:fill="F2F4F8" w:val="clear"/>
+        <w:spacing w:after="160" w:before="0" w:line="264"/>
+        <w:ind w:left="280" w:right="120"/>
+      </w:pPr>
+      <w:r>
+        <w:t xml:space="preserve"/>
+      </w:r>
+      <w:r>
+        <w:rPr>
+          <w:b/>
+          <w:bCs/>
+        </w:rPr>
+        <w:t xml:space="preserve">Three, the clients.</w:t>
+      </w:r>
+      <w:r>
+        <w:t xml:space="preserve"> A Moncler hospitality program: your top clients hosted across the season, Monaco, Monza, Las Vegas, with the paddock, the garage and the drivers as the experience. Twenty guests per weekend from seven passes. Money cannot buy the access. A Moncler client card can."</w:t>
+      </w:r>
+    </w:p>
+    <w:p>
+      <w:r>
+        <w:br w:type="page"/>
+      </w:r>
+    </w:p>
+    <w:p>
+      <w:pPr>
+        <w:pStyle w:val="Heading1"/>
+        <w:spacing w:after="160" w:before="360"/>
+      </w:pPr>
+      <w:r>
+        <w:t xml:space="preserve">Part 5: Questions they may ask. Prepared answers.</w:t>
+      </w:r>
+    </w:p>
+    <w:p>
+      <w:pPr>
+        <w:spacing w:after="100" w:before="60"/>
+      </w:pPr>
+      <w:r>
+        <w:rPr>
+          <w:i/>
+          <w:iCs/>
+          <w:color w:val="595959"/>
+          <w:sz w:val="20"/>
+          <w:szCs w:val="20"/>
+        </w:rPr>
         <w:t xml:space="preserve">[Quick index. Jump to any answer from the outline sidebar.]</w:t>
       </w:r>
     </w:p>
@@ -2465,7 +2541,7 @@
         <w:t xml:space="preserve">A driver personally.</w:t>
       </w:r>
       <w:r>
-        <w:t xml:space="preserve"> The face, not the team. Campaign rights, personal channels, appearance days. Fashion houses use drivers as ambassadors all the time. Simpler and cheaper, but no team rights, no car, no paddock hospitality.</w:t>
+        <w:t xml:space="preserve"> The face, not the team. Campaign rights, personal channels, appearance days. Fashion houses use drivers as ambassadors all the time, and this is exactly what our athlete department, Ellery's world, builds every day. Simpler and cheaper, but no team rights, no car, no paddock hospitality.</w:t>
       </w:r>
     </w:p>
     <w:p>

</xml_diff>

<commit_message>
Reset the Moncler opening to a first call
No reconnect framing: thank them for the time, the timing line on
fashion as a focal point of motorsport and F1 culture, introduce
Bjorn and Ellery with the quick reason both are here, then set the
stage. The separate why-this-team block folds into the greeting.

Co-Authored-By: Claude Fable 5 <noreply@anthropic.com>
Claude-Session: https://claude.ai/code/session_011Vvxd2V3zerAfjn84yXuuv
</commit_message>
<xml_diff>
--- a/call-scripts/Moncler-F1-Discovery-Call-Script.docx
+++ b/call-scripts/Moncler-F1-Discovery-Call-Script.docx
@@ -63,7 +63,7 @@
         <w:t xml:space="preserve">Call type:</w:t>
       </w:r>
       <w:r>
-        <w:t xml:space="preserve"> Discovery, second touch: you connected with [Name] last week, so the opening is a reconnect, not a first meeting. Goal: bring in the right people as promised, understand Moncler's objectives, fill out the brief, show how F1 fits a luxury house, agree next steps.</w:t>
+        <w:t xml:space="preserve"> First call / discovery. Goal: open warmly, introduce Bjorn and Ellery and why they are both here, set the stage on SPORTFIVE and yourself, understand Moncler's objectives, fill out the brief, show how F1 fits a luxury house, agree next steps.</w:t>
       </w:r>
     </w:p>
     <w:p>
@@ -819,7 +819,7 @@
           <w:sz w:val="20"/>
           <w:szCs w:val="20"/>
         </w:rPr>
-        <w:t xml:space="preserve">[This is a reconnect, not a first meeting. Warm and familiar with [Name]; the fuller background is for anyone on their side who is new. Smile. Take your time.]</w:t>
+        <w:t xml:space="preserve">[This is a first call. After hellos and small talk. Smile. Take your time.]</w:t>
       </w:r>
     </w:p>
     <w:p>
@@ -832,20 +832,33 @@
         <w:ind w:left="280" w:right="120"/>
       </w:pPr>
       <w:r>
-        <w:t xml:space="preserve">"[Name], great to connect again. It was a pleasure speaking last week, and thank you for the time today. I really appreciate it. And let me say it: it is a pleasure to be speaking with an amazing brand like Moncler, at a moment when fashion has become such an integral part of motorsport, and of Formula 1 above all.</w:t>
-      </w:r>
-    </w:p>
-    <w:p>
-      <w:pPr>
-        <w:pBdr>
-          <w:left w:val="single" w:color="1F3864" w:sz="18"/>
-        </w:pBdr>
-        <w:shd w:fill="F2F4F8" w:val="clear"/>
-        <w:spacing w:after="60" w:before="0" w:line="264"/>
-        <w:ind w:left="280" w:right="120"/>
-      </w:pPr>
-      <w:r>
-        <w:t xml:space="preserve">As promised, I wanted to involve the right people for this conversation. So joining me today are Bjorn, who I work very closely with on our Formula 1 business, and Ellery, who is part of our athlete department. I will explain in a moment why I wanted them both here.</w:t>
+        <w:t xml:space="preserve">"Thank you for your time today, [Name]. I really appreciate it. And I think it is quite a good time to be speaking with an amazing brand like Moncler, at a moment when fashion has become such a focal point of motorsport, and of Formula 1 in particular, where it is now deeply ingrained in the culture of the sport.</w:t>
+      </w:r>
+    </w:p>
+    <w:p>
+      <w:pPr>
+        <w:pBdr>
+          <w:left w:val="single" w:color="1F3864" w:sz="18"/>
+        </w:pBdr>
+        <w:shd w:fill="F2F4F8" w:val="clear"/>
+        <w:spacing w:after="60" w:before="0" w:line="264"/>
+        <w:ind w:left="280" w:right="120"/>
+      </w:pPr>
+      <w:r>
+        <w:t xml:space="preserve">Joining me today are Bjorn, who I work very closely with in our Formula 1 business, and Ellery, who is part of our athlete department.</w:t>
+      </w:r>
+    </w:p>
+    <w:p>
+      <w:pPr>
+        <w:pBdr>
+          <w:left w:val="single" w:color="1F3864" w:sz="18"/>
+        </w:pBdr>
+        <w:shd w:fill="F2F4F8" w:val="clear"/>
+        <w:spacing w:after="60" w:before="0" w:line="264"/>
+        <w:ind w:left="280" w:right="120"/>
+      </w:pPr>
+      <w:r>
+        <w:t xml:space="preserve">Let me quickly say why it made sense to have them both here. Bjorn and I drive the Formula 1 partnerships side by side. And Ellery is here because SPORTFIVE is not a one-dimensional agency. Formula 1 is one big side of what we do, but we also have other business functions across sport, including a dedicated athlete department. For a house like Moncler, an athlete angle could make a lot of sense as well, so I wanted that door open from the start.</w:t>
       </w:r>
     </w:p>
     <w:p>
@@ -858,7 +871,7 @@
         <w:ind w:left="280" w:right="120"/>
       </w:pPr>
       <w:r>
-        <w:t xml:space="preserve">Before we dive into the discussion, let me quickly set the stage: a little context on SPORTFIVE and myself, especially for anyone who was not part of last week's chat, and then the context for the call today, what I would like us to get out of it. Sound good?"</w:t>
+        <w:t xml:space="preserve">Before we dive into the discussion, let me quickly set the stage: a little context on SPORTFIVE and myself, and then the context for the call today, what I would like us to get out of it. Sound good?"</w:t>
       </w:r>
     </w:p>
     <w:p>
@@ -1020,54 +1033,6 @@
       </w:pPr>
       <w:r>
         <w:t xml:space="preserve">So the best place to start is your objectives, and we work back from there to the right fit."</w:t>
-      </w:r>
-    </w:p>
-    <w:p>
-      <w:pPr>
-        <w:pStyle w:val="Heading3"/>
-        <w:spacing w:after="100" w:before="240"/>
-      </w:pPr>
-      <w:r>
-        <w:t xml:space="preserve">Why this team, on this call</w:t>
-      </w:r>
-    </w:p>
-    <w:p>
-      <w:pPr>
-        <w:pBdr>
-          <w:left w:val="single" w:color="1F3864" w:sz="18"/>
-        </w:pBdr>
-        <w:shd w:fill="F2F4F8" w:val="clear"/>
-        <w:spacing w:after="60" w:before="80" w:line="264"/>
-        <w:ind w:left="280" w:right="120"/>
-      </w:pPr>
-      <w:r>
-        <w:t xml:space="preserve">"And one more thing about us, because it explains who is sitting with me today.</w:t>
-      </w:r>
-    </w:p>
-    <w:p>
-      <w:pPr>
-        <w:pBdr>
-          <w:left w:val="single" w:color="1F3864" w:sz="18"/>
-        </w:pBdr>
-        <w:shd w:fill="F2F4F8" w:val="clear"/>
-        <w:spacing w:after="60" w:before="0" w:line="264"/>
-        <w:ind w:left="280" w:right="120"/>
-      </w:pPr>
-      <w:r>
-        <w:t xml:space="preserve">SPORTFIVE is not a one-dimensional agency. Formula 1 is one side of what we do, and a big one. But we have other business functions across sport, including a dedicated athlete department.</w:t>
-      </w:r>
-    </w:p>
-    <w:p>
-      <w:pPr>
-        <w:pBdr>
-          <w:left w:val="single" w:color="1F3864" w:sz="18"/>
-        </w:pBdr>
-        <w:shd w:fill="F2F4F8" w:val="clear"/>
-        <w:spacing w:after="160" w:before="0" w:line="264"/>
-        <w:ind w:left="280" w:right="120"/>
-      </w:pPr>
-      <w:r>
-        <w:t xml:space="preserve">Why does that matter for Moncler? Because it means we can explore opportunities beyond Formula 1 alone. For a house like yours, an athlete angle could make a lot of sense as well. That is exactly why I asked Ellery to join us today."</w:t>
       </w:r>
     </w:p>
     <w:p>

</xml_diff>

<commit_message>
Add the teams-available answer to the Moncler Q&A
New Q6: no availability promises on the call; explain that F1
fashion contracts define categories narrowly so the whole category
is rarely blocked, then the two-step work, define Moncler's direct
competitors and category, verify it team by team at the grid
mapping. Later questions renumbered to Q7 through Q13.

Co-Authored-By: Claude Fable 5 <noreply@anthropic.com>
Claude-Session: https://claude.ai/code/session_011Vvxd2V3zerAfjn84yXuuv
</commit_message>
<xml_diff>
--- a/call-scripts/Moncler-F1-Discovery-Call-Script.docx
+++ b/call-scripts/Moncler-F1-Discovery-Call-Script.docx
@@ -2233,85 +2233,98 @@
         <w:spacing w:after="60"/>
       </w:pPr>
       <w:r>
-        <w:t xml:space="preserve">Q6. Measuring ROI</w:t>
-      </w:r>
-    </w:p>
-    <w:p>
-      <w:pPr>
-        <w:pStyle w:val="ListParagraph"/>
-        <w:numPr>
-          <w:ilvl w:val="0"/>
-          <w:numId w:val="2"/>
-        </w:numPr>
-        <w:spacing w:after="60"/>
-      </w:pPr>
-      <w:r>
-        <w:t xml:space="preserve">Q7. Who owns Formula 1</w:t>
-      </w:r>
-    </w:p>
-    <w:p>
-      <w:pPr>
-        <w:pStyle w:val="ListParagraph"/>
-        <w:numPr>
-          <w:ilvl w:val="0"/>
-          <w:numId w:val="2"/>
-        </w:numPr>
-        <w:spacing w:after="60"/>
-      </w:pPr>
-      <w:r>
-        <w:t xml:space="preserve">Q8. Cost, and why F1 is expensive</w:t>
-      </w:r>
-    </w:p>
-    <w:p>
-      <w:pPr>
-        <w:pStyle w:val="ListParagraph"/>
-        <w:numPr>
-          <w:ilvl w:val="0"/>
-          <w:numId w:val="2"/>
-        </w:numPr>
-        <w:spacing w:after="60"/>
-      </w:pPr>
-      <w:r>
-        <w:t xml:space="preserve">Q9. Why SPORTFIVE, why not go direct</w:t>
-      </w:r>
-    </w:p>
-    <w:p>
-      <w:pPr>
-        <w:pStyle w:val="ListParagraph"/>
-        <w:numPr>
-          <w:ilvl w:val="0"/>
-          <w:numId w:val="2"/>
-        </w:numPr>
-        <w:spacing w:after="60"/>
-      </w:pPr>
-      <w:r>
-        <w:t xml:space="preserve">Q10. Is the audience not mostly men</w:t>
-      </w:r>
-    </w:p>
-    <w:p>
-      <w:pPr>
-        <w:pStyle w:val="ListParagraph"/>
-        <w:numPr>
-          <w:ilvl w:val="0"/>
-          <w:numId w:val="2"/>
-        </w:numPr>
-        <w:spacing w:after="60"/>
-      </w:pPr>
-      <w:r>
-        <w:t xml:space="preserve">Q11. Are competitors already in</w:t>
-      </w:r>
-    </w:p>
-    <w:p>
-      <w:pPr>
-        <w:pStyle w:val="ListParagraph"/>
-        <w:numPr>
-          <w:ilvl w:val="0"/>
-          <w:numId w:val="2"/>
-        </w:numPr>
-        <w:spacing w:after="60"/>
-      </w:pPr>
-      <w:r>
-        <w:t xml:space="preserve">Q12. Rights, licensing and merchandise: how would it work</w:t>
+        <w:t xml:space="preserve">Q6. Which teams are available</w:t>
+      </w:r>
+    </w:p>
+    <w:p>
+      <w:pPr>
+        <w:pStyle w:val="ListParagraph"/>
+        <w:numPr>
+          <w:ilvl w:val="0"/>
+          <w:numId w:val="2"/>
+        </w:numPr>
+        <w:spacing w:after="60"/>
+      </w:pPr>
+      <w:r>
+        <w:t xml:space="preserve">Q7. Measuring ROI</w:t>
+      </w:r>
+    </w:p>
+    <w:p>
+      <w:pPr>
+        <w:pStyle w:val="ListParagraph"/>
+        <w:numPr>
+          <w:ilvl w:val="0"/>
+          <w:numId w:val="2"/>
+        </w:numPr>
+        <w:spacing w:after="60"/>
+      </w:pPr>
+      <w:r>
+        <w:t xml:space="preserve">Q8. Who owns Formula 1</w:t>
+      </w:r>
+    </w:p>
+    <w:p>
+      <w:pPr>
+        <w:pStyle w:val="ListParagraph"/>
+        <w:numPr>
+          <w:ilvl w:val="0"/>
+          <w:numId w:val="2"/>
+        </w:numPr>
+        <w:spacing w:after="60"/>
+      </w:pPr>
+      <w:r>
+        <w:t xml:space="preserve">Q9. Cost, and why F1 is expensive</w:t>
+      </w:r>
+    </w:p>
+    <w:p>
+      <w:pPr>
+        <w:pStyle w:val="ListParagraph"/>
+        <w:numPr>
+          <w:ilvl w:val="0"/>
+          <w:numId w:val="2"/>
+        </w:numPr>
+        <w:spacing w:after="60"/>
+      </w:pPr>
+      <w:r>
+        <w:t xml:space="preserve">Q10. Why SPORTFIVE, why not go direct</w:t>
+      </w:r>
+    </w:p>
+    <w:p>
+      <w:pPr>
+        <w:pStyle w:val="ListParagraph"/>
+        <w:numPr>
+          <w:ilvl w:val="0"/>
+          <w:numId w:val="2"/>
+        </w:numPr>
+        <w:spacing w:after="60"/>
+      </w:pPr>
+      <w:r>
+        <w:t xml:space="preserve">Q11. Is the audience not mostly men</w:t>
+      </w:r>
+    </w:p>
+    <w:p>
+      <w:pPr>
+        <w:pStyle w:val="ListParagraph"/>
+        <w:numPr>
+          <w:ilvl w:val="0"/>
+          <w:numId w:val="2"/>
+        </w:numPr>
+        <w:spacing w:after="60"/>
+      </w:pPr>
+      <w:r>
+        <w:t xml:space="preserve">Q12. Are competitors already in</w:t>
+      </w:r>
+    </w:p>
+    <w:p>
+      <w:pPr>
+        <w:pStyle w:val="ListParagraph"/>
+        <w:numPr>
+          <w:ilvl w:val="0"/>
+          <w:numId w:val="2"/>
+        </w:numPr>
+        <w:spacing w:after="60"/>
+      </w:pPr>
+      <w:r>
+        <w:t xml:space="preserve">Q13. Rights, licensing and merchandise: how would it work</w:t>
       </w:r>
     </w:p>
     <w:p>
@@ -2724,7 +2737,7 @@
         <w:spacing w:after="120" w:before="280"/>
       </w:pPr>
       <w:r>
-        <w:t xml:space="preserve">Q6. "How is ROI measured in Formula 1?</w:t>
+        <w:t xml:space="preserve">Q6. "So which teams are available for us?</w:t>
       </w:r>
     </w:p>
     <w:p>
@@ -2737,99 +2750,33 @@
         <w:ind w:left="280" w:right="120"/>
       </w:pPr>
       <w:r>
-        <w:t xml:space="preserve">"Four ways, usually.</w:t>
-      </w:r>
-    </w:p>
-    <w:p>
-      <w:pPr>
-        <w:pBdr>
-          <w:left w:val="single" w:color="1F3864" w:sz="18"/>
-        </w:pBdr>
-        <w:shd w:fill="F2F4F8" w:val="clear"/>
-        <w:spacing w:after="60" w:before="0" w:line="264"/>
-        <w:ind w:left="280" w:right="120"/>
-      </w:pPr>
-      <w:r>
-        <w:t xml:space="preserve"/>
-      </w:r>
-      <w:r>
-        <w:rPr>
-          <w:b/>
-          <w:bCs/>
-        </w:rPr>
-        <w:t xml:space="preserve">Media value.</w:t>
-      </w:r>
-      <w:r>
-        <w:t xml:space="preserve"> Independent firms like Nielsen track every second your branding appears, across TV and digital, and give it a money value against your fee.</w:t>
-      </w:r>
-    </w:p>
-    <w:p>
-      <w:pPr>
-        <w:pBdr>
-          <w:left w:val="single" w:color="1F3864" w:sz="18"/>
-        </w:pBdr>
-        <w:shd w:fill="F2F4F8" w:val="clear"/>
-        <w:spacing w:after="60" w:before="0" w:line="264"/>
-        <w:ind w:left="280" w:right="120"/>
-      </w:pPr>
-      <w:r>
-        <w:t xml:space="preserve"/>
-      </w:r>
-      <w:r>
-        <w:rPr>
-          <w:b/>
-          <w:bCs/>
-        </w:rPr>
-        <w:t xml:space="preserve">Brand tracking.</w:t>
-      </w:r>
-      <w:r>
-        <w:t xml:space="preserve"> Awareness, consideration and image shift among fans, measured before and after. And this audience responds: in the US, fans are 32% more likely to consider a sponsor's product, and among women it is 41%.</w:t>
-      </w:r>
-    </w:p>
-    <w:p>
-      <w:pPr>
-        <w:pBdr>
-          <w:left w:val="single" w:color="1F3864" w:sz="18"/>
-        </w:pBdr>
-        <w:shd w:fill="F2F4F8" w:val="clear"/>
-        <w:spacing w:after="60" w:before="0" w:line="264"/>
-        <w:ind w:left="280" w:right="120"/>
-      </w:pPr>
-      <w:r>
-        <w:t xml:space="preserve"/>
-      </w:r>
-      <w:r>
-        <w:rPr>
-          <w:b/>
-          <w:bCs/>
-        </w:rPr>
-        <w:t xml:space="preserve">Commercial signals.</w:t>
-      </w:r>
-      <w:r>
-        <w:t xml:space="preserve"> For a house like Moncler: capsule sell-through, traffic in race-week boutiques, growth in the markets you activate.</w:t>
-      </w:r>
-    </w:p>
-    <w:p>
-      <w:pPr>
-        <w:pBdr>
-          <w:left w:val="single" w:color="1F3864" w:sz="18"/>
-        </w:pBdr>
-        <w:shd w:fill="F2F4F8" w:val="clear"/>
-        <w:spacing w:after="60" w:before="0" w:line="264"/>
-        <w:ind w:left="280" w:right="120"/>
-      </w:pPr>
-      <w:r>
-        <w:t xml:space="preserve"/>
-      </w:r>
-      <w:r>
-        <w:rPr>
-          <w:b/>
-          <w:bCs/>
-        </w:rPr>
-        <w:t xml:space="preserve">Client outcomes.</w:t>
-      </w:r>
-      <w:r>
-        <w:t xml:space="preserve"> Who you hosted, and what those relationships produced: retention and spend of top clients after a race weekend.</w:t>
+        <w:t xml:space="preserve">"The honest answer is: I will not promise you availability on this call, because in this sport that answer is only worth something once it is verified.</w:t>
+      </w:r>
+    </w:p>
+    <w:p>
+      <w:pPr>
+        <w:pBdr>
+          <w:left w:val="single" w:color="1F3864" w:sz="18"/>
+        </w:pBdr>
+        <w:shd w:fill="F2F4F8" w:val="clear"/>
+        <w:spacing w:after="60" w:before="0" w:line="264"/>
+        <w:ind w:left="280" w:right="120"/>
+      </w:pPr>
+      <w:r>
+        <w:t xml:space="preserve">And here is why. The fashion category in Formula 1 is more complex than it looks. When a brand signs with a team, it usually does not block the whole of fashion. Contracts define categories narrowly: technical racewear is one seat, formal wear another, luggage, eyewear, watches, luxury outerwear, each can be its own line. So a team that looks full of fashion partners can still have your exact seat open. And a team that looks empty may have it quietly blocked.</w:t>
+      </w:r>
+    </w:p>
+    <w:p>
+      <w:pPr>
+        <w:pBdr>
+          <w:left w:val="single" w:color="1F3864" w:sz="18"/>
+        </w:pBdr>
+        <w:shd w:fill="F2F4F8" w:val="clear"/>
+        <w:spacing w:after="60" w:before="0" w:line="264"/>
+        <w:ind w:left="280" w:right="120"/>
+      </w:pPr>
+      <w:r>
+        <w:t xml:space="preserve">So the real work is two steps. First, we define who Moncler's direct competitors are, and what your category should cover: wide enough to protect you, precise enough to be sellable. Then we check that exact definition against all eleven teams: who holds what, under which definition, and until when.</w:t>
       </w:r>
     </w:p>
     <w:p>
@@ -2842,7 +2789,7 @@
         <w:ind w:left="280" w:right="120"/>
       </w:pPr>
       <w:r>
-        <w:t xml:space="preserve">You agree the framework upfront and review it with the team every quarter. The good teams manage a partnership like a business."</w:t>
+        <w:t xml:space="preserve">That is part of the grid mapping we do after this call. When we come back with recommendations, you get the true availability picture, team by team. A guess today would only fall apart in a contract review, and you deserve better than that."</w:t>
       </w:r>
     </w:p>
     <w:p>
@@ -2851,7 +2798,7 @@
         <w:spacing w:after="120" w:before="280"/>
       </w:pPr>
       <w:r>
-        <w:t xml:space="preserve">Q7. "Who owns Formula 1? How does the money work?</w:t>
+        <w:t xml:space="preserve">Q7. "How is ROI measured in Formula 1?</w:t>
       </w:r>
     </w:p>
     <w:p>
@@ -2864,46 +2811,99 @@
         <w:ind w:left="280" w:right="120"/>
       </w:pPr>
       <w:r>
-        <w:t xml:space="preserve">"Three layers, very simple.</w:t>
-      </w:r>
-    </w:p>
-    <w:p>
-      <w:pPr>
-        <w:pBdr>
-          <w:left w:val="single" w:color="1F3864" w:sz="18"/>
-        </w:pBdr>
-        <w:shd w:fill="F2F4F8" w:val="clear"/>
-        <w:spacing w:after="60" w:before="0" w:line="264"/>
-        <w:ind w:left="280" w:right="120"/>
-      </w:pPr>
-      <w:r>
-        <w:t xml:space="preserve">Liberty Media, an American media company, owns Formula 1 itself. They bought it in 2017. They control the commercial rights: races, broadcast deals, the calendar.</w:t>
-      </w:r>
-    </w:p>
-    <w:p>
-      <w:pPr>
-        <w:pBdr>
-          <w:left w:val="single" w:color="1F3864" w:sz="18"/>
-        </w:pBdr>
-        <w:shd w:fill="F2F4F8" w:val="clear"/>
-        <w:spacing w:after="60" w:before="0" w:line="264"/>
-        <w:ind w:left="280" w:right="120"/>
-      </w:pPr>
-      <w:r>
-        <w:t xml:space="preserve">The FIA is the independent regulator.</w:t>
-      </w:r>
-    </w:p>
-    <w:p>
-      <w:pPr>
-        <w:pBdr>
-          <w:left w:val="single" w:color="1F3864" w:sz="18"/>
-        </w:pBdr>
-        <w:shd w:fill="F2F4F8" w:val="clear"/>
-        <w:spacing w:after="60" w:before="0" w:line="264"/>
-        <w:ind w:left="280" w:right="120"/>
-      </w:pPr>
-      <w:r>
-        <w:t xml:space="preserve">The eleven teams are independent businesses: Ferrari, Mercedes and Audi belong to car makers, Red Bull to the drinks company, others to investors. Each team earns a share of the sport's revenues plus its own sponsorships.</w:t>
+        <w:t xml:space="preserve">"Four ways, usually.</w:t>
+      </w:r>
+    </w:p>
+    <w:p>
+      <w:pPr>
+        <w:pBdr>
+          <w:left w:val="single" w:color="1F3864" w:sz="18"/>
+        </w:pBdr>
+        <w:shd w:fill="F2F4F8" w:val="clear"/>
+        <w:spacing w:after="60" w:before="0" w:line="264"/>
+        <w:ind w:left="280" w:right="120"/>
+      </w:pPr>
+      <w:r>
+        <w:t xml:space="preserve"/>
+      </w:r>
+      <w:r>
+        <w:rPr>
+          <w:b/>
+          <w:bCs/>
+        </w:rPr>
+        <w:t xml:space="preserve">Media value.</w:t>
+      </w:r>
+      <w:r>
+        <w:t xml:space="preserve"> Independent firms like Nielsen track every second your branding appears, across TV and digital, and give it a money value against your fee.</w:t>
+      </w:r>
+    </w:p>
+    <w:p>
+      <w:pPr>
+        <w:pBdr>
+          <w:left w:val="single" w:color="1F3864" w:sz="18"/>
+        </w:pBdr>
+        <w:shd w:fill="F2F4F8" w:val="clear"/>
+        <w:spacing w:after="60" w:before="0" w:line="264"/>
+        <w:ind w:left="280" w:right="120"/>
+      </w:pPr>
+      <w:r>
+        <w:t xml:space="preserve"/>
+      </w:r>
+      <w:r>
+        <w:rPr>
+          <w:b/>
+          <w:bCs/>
+        </w:rPr>
+        <w:t xml:space="preserve">Brand tracking.</w:t>
+      </w:r>
+      <w:r>
+        <w:t xml:space="preserve"> Awareness, consideration and image shift among fans, measured before and after. And this audience responds: in the US, fans are 32% more likely to consider a sponsor's product, and among women it is 41%.</w:t>
+      </w:r>
+    </w:p>
+    <w:p>
+      <w:pPr>
+        <w:pBdr>
+          <w:left w:val="single" w:color="1F3864" w:sz="18"/>
+        </w:pBdr>
+        <w:shd w:fill="F2F4F8" w:val="clear"/>
+        <w:spacing w:after="60" w:before="0" w:line="264"/>
+        <w:ind w:left="280" w:right="120"/>
+      </w:pPr>
+      <w:r>
+        <w:t xml:space="preserve"/>
+      </w:r>
+      <w:r>
+        <w:rPr>
+          <w:b/>
+          <w:bCs/>
+        </w:rPr>
+        <w:t xml:space="preserve">Commercial signals.</w:t>
+      </w:r>
+      <w:r>
+        <w:t xml:space="preserve"> For a house like Moncler: capsule sell-through, traffic in race-week boutiques, growth in the markets you activate.</w:t>
+      </w:r>
+    </w:p>
+    <w:p>
+      <w:pPr>
+        <w:pBdr>
+          <w:left w:val="single" w:color="1F3864" w:sz="18"/>
+        </w:pBdr>
+        <w:shd w:fill="F2F4F8" w:val="clear"/>
+        <w:spacing w:after="60" w:before="0" w:line="264"/>
+        <w:ind w:left="280" w:right="120"/>
+      </w:pPr>
+      <w:r>
+        <w:t xml:space="preserve"/>
+      </w:r>
+      <w:r>
+        <w:rPr>
+          <w:b/>
+          <w:bCs/>
+        </w:rPr>
+        <w:t xml:space="preserve">Client outcomes.</w:t>
+      </w:r>
+      <w:r>
+        <w:t xml:space="preserve"> Who you hosted, and what those relationships produced: retention and spend of top clients after a race weekend.</w:t>
       </w:r>
     </w:p>
     <w:p>
@@ -2916,7 +2916,7 @@
         <w:ind w:left="280" w:right="120"/>
       </w:pPr>
       <w:r>
-        <w:t xml:space="preserve">Since 2021 the sport has a cost cap, so teams became profitable, stable businesses. Team sponsorship has doubled since 2020, to 2.2 billion dollars a year. You would be entering a healthy, growing market."</w:t>
+        <w:t xml:space="preserve">You agree the framework upfront and review it with the team every quarter. The good teams manage a partnership like a business."</w:t>
       </w:r>
     </w:p>
     <w:p>
@@ -2925,7 +2925,81 @@
         <w:spacing w:after="120" w:before="280"/>
       </w:pPr>
       <w:r>
-        <w:t xml:space="preserve">Q8. "What does a partnership cost, and why is Formula 1 so expensive?</w:t>
+        <w:t xml:space="preserve">Q8. "Who owns Formula 1? How does the money work?</w:t>
+      </w:r>
+    </w:p>
+    <w:p>
+      <w:pPr>
+        <w:pBdr>
+          <w:left w:val="single" w:color="1F3864" w:sz="18"/>
+        </w:pBdr>
+        <w:shd w:fill="F2F4F8" w:val="clear"/>
+        <w:spacing w:after="60" w:before="80" w:line="264"/>
+        <w:ind w:left="280" w:right="120"/>
+      </w:pPr>
+      <w:r>
+        <w:t xml:space="preserve">"Three layers, very simple.</w:t>
+      </w:r>
+    </w:p>
+    <w:p>
+      <w:pPr>
+        <w:pBdr>
+          <w:left w:val="single" w:color="1F3864" w:sz="18"/>
+        </w:pBdr>
+        <w:shd w:fill="F2F4F8" w:val="clear"/>
+        <w:spacing w:after="60" w:before="0" w:line="264"/>
+        <w:ind w:left="280" w:right="120"/>
+      </w:pPr>
+      <w:r>
+        <w:t xml:space="preserve">Liberty Media, an American media company, owns Formula 1 itself. They bought it in 2017. They control the commercial rights: races, broadcast deals, the calendar.</w:t>
+      </w:r>
+    </w:p>
+    <w:p>
+      <w:pPr>
+        <w:pBdr>
+          <w:left w:val="single" w:color="1F3864" w:sz="18"/>
+        </w:pBdr>
+        <w:shd w:fill="F2F4F8" w:val="clear"/>
+        <w:spacing w:after="60" w:before="0" w:line="264"/>
+        <w:ind w:left="280" w:right="120"/>
+      </w:pPr>
+      <w:r>
+        <w:t xml:space="preserve">The FIA is the independent regulator.</w:t>
+      </w:r>
+    </w:p>
+    <w:p>
+      <w:pPr>
+        <w:pBdr>
+          <w:left w:val="single" w:color="1F3864" w:sz="18"/>
+        </w:pBdr>
+        <w:shd w:fill="F2F4F8" w:val="clear"/>
+        <w:spacing w:after="60" w:before="0" w:line="264"/>
+        <w:ind w:left="280" w:right="120"/>
+      </w:pPr>
+      <w:r>
+        <w:t xml:space="preserve">The eleven teams are independent businesses: Ferrari, Mercedes and Audi belong to car makers, Red Bull to the drinks company, others to investors. Each team earns a share of the sport's revenues plus its own sponsorships.</w:t>
+      </w:r>
+    </w:p>
+    <w:p>
+      <w:pPr>
+        <w:pBdr>
+          <w:left w:val="single" w:color="1F3864" w:sz="18"/>
+        </w:pBdr>
+        <w:shd w:fill="F2F4F8" w:val="clear"/>
+        <w:spacing w:after="160" w:before="0" w:line="264"/>
+        <w:ind w:left="280" w:right="120"/>
+      </w:pPr>
+      <w:r>
+        <w:t xml:space="preserve">Since 2021 the sport has a cost cap, so teams became profitable, stable businesses. Team sponsorship has doubled since 2020, to 2.2 billion dollars a year. You would be entering a healthy, growing market."</w:t>
+      </w:r>
+    </w:p>
+    <w:p>
+      <w:pPr>
+        <w:pStyle w:val="Heading2"/>
+        <w:spacing w:after="120" w:before="280"/>
+      </w:pPr>
+      <w:r>
+        <w:t xml:space="preserve">Q9. "What does a partnership cost, and why is Formula 1 so expensive?</w:t>
       </w:r>
     </w:p>
     <w:p>
@@ -3068,7 +3142,7 @@
         <w:spacing w:after="120" w:before="280"/>
       </w:pPr>
       <w:r>
-        <w:t xml:space="preserve">Q9. "Why work with SPORTFIVE? Could we not go to a team directly?</w:t>
+        <w:t xml:space="preserve">Q10. "Why work with SPORTFIVE? Could we not go to a team directly?</w:t>
       </w:r>
     </w:p>
     <w:p>
@@ -3129,7 +3203,7 @@
         <w:spacing w:after="120" w:before="280"/>
       </w:pPr>
       <w:r>
-        <w:t xml:space="preserve">Q10. "Is the audience not mostly men who love cars?</w:t>
+        <w:t xml:space="preserve">Q11. "Is the audience not mostly men who love cars?</w:t>
       </w:r>
     </w:p>
     <w:p>
@@ -3177,7 +3251,7 @@
         <w:spacing w:after="120" w:before="280"/>
       </w:pPr>
       <w:r>
-        <w:t xml:space="preserve">Q11. "Are any of our competitors already in Formula 1?</w:t>
+        <w:t xml:space="preserve">Q12. "Are any of our competitors already in Formula 1?</w:t>
       </w:r>
     </w:p>
     <w:p>
@@ -3212,7 +3286,7 @@
         <w:spacing w:after="120" w:before="280"/>
       </w:pPr>
       <w:r>
-        <w:t xml:space="preserve">Q12. "If we create product together, how do rights, licensing and merchandise work?</w:t>
+        <w:t xml:space="preserve">Q13. "If we create product together, how do rights, licensing and merchandise work?</w:t>
       </w:r>
     </w:p>
     <w:p>

</xml_diff>

<commit_message>
Point the Moncler prep notes at the new availability answer
Co-Authored-By: Claude Fable 5 <noreply@anthropic.com>
Claude-Session: https://claude.ai/code/session_011Vvxd2V3zerAfjn84yXuuv
</commit_message>
<xml_diff>
--- a/call-scripts/Moncler-F1-Discovery-Call-Script.docx
+++ b/call-scripts/Moncler-F1-Discovery-Call-Script.docx
@@ -600,7 +600,7 @@
         <w:t xml:space="preserve">Category picture:</w:t>
       </w:r>
       <w:r>
-        <w:t xml:space="preserve"> every team's racewear is held by sportswear brands (Puma at Ferrari, Aston Martin and McLaren; adidas at Mercedes and Audi; Castore at Red Bull, Alpine and Haas). That is technical teamwear, not Moncler's seat. The luxury and lifestyle space next to it is where the conversation lives, and Brioni's bespoke partnership with Alpine is the proof it exists. Do not claim any category open; we verify at recommendations.</w:t>
+        <w:t xml:space="preserve"> every team's racewear is held by sportswear brands (Puma at Ferrari, Aston Martin and McLaren; adidas at Mercedes and Audi; Castore at Red Bull, Alpine and Haas). That is technical teamwear, not Moncler's seat. The luxury and lifestyle space next to it is where the conversation lives, and Brioni's bespoke partnership with Alpine is the proof it exists. Do not claim any category open; we verify at recommendations. Q6 handles the availability question without promises.</w:t>
       </w:r>
     </w:p>
     <w:p>
@@ -3501,7 +3501,7 @@
         <w:spacing w:after="60"/>
       </w:pPr>
       <w:r>
-        <w:t xml:space="preserve">Brief the internal team for the grid mapping. Verify luxury apparel, outerwear and lifestyle categories across all eleven teams fresh, plus driver ambassador options.</w:t>
+        <w:t xml:space="preserve">Brief the internal team for the grid mapping. Define Moncler's direct competitor set and category wording, then verify luxury apparel, outerwear and lifestyle categories across all eleven teams fresh, plus driver ambassador options.</w:t>
       </w:r>
     </w:p>
     <w:p>

</xml_diff>

<commit_message>
Rewrite the Moncler discovery questions in a human tone
Part 3 becomes conversation starters: open the story, the dream and
the fear, a four-question block on the Mercedes-Benz Mondo G
experience, sharper audience and clienteling asks, and warmer budget,
timing and hospitality closers.

Co-Authored-By: Claude Fable 5 <noreply@anthropic.com>
Claude-Session: https://claude.ai/code/session_011Vvxd2V3zerAfjn84yXuuv
</commit_message>
<xml_diff>
--- a/call-scripts/Moncler-F1-Discovery-Call-Script.docx
+++ b/call-scripts/Moncler-F1-Discovery-Call-Script.docx
@@ -1262,7 +1262,7 @@
           <w:sz w:val="20"/>
           <w:szCs w:val="20"/>
         </w:rPr>
-        <w:t xml:space="preserve">[Work through these as a conversation, not a checklist. Follow their energy. The bold labels are for you; the questions are for them. Capture answers, they become the brief.]</w:t>
+        <w:t xml:space="preserve">[These are conversation starters, not a form. Ask one, then stay quiet and follow what they give you. The bold labels are for you; the words are for them. Capture answers, they become the brief.]</w:t>
       </w:r>
     </w:p>
     <w:p>
@@ -1271,33 +1271,33 @@
         <w:spacing w:after="100" w:before="240"/>
       </w:pPr>
       <w:r>
-        <w:t xml:space="preserve">Objectives</w:t>
-      </w:r>
-    </w:p>
-    <w:p>
-      <w:pPr>
-        <w:pStyle w:val="ListParagraph"/>
-        <w:numPr>
-          <w:ilvl w:val="0"/>
-          <w:numId w:val="2"/>
-        </w:numPr>
-        <w:spacing w:after="60"/>
-      </w:pPr>
-      <w:r>
-        <w:t xml:space="preserve">"What would Formula 1 need to do for Moncler? New audiences, heat for the brand, a bigger stage in the US and Asia, or something else?"</w:t>
-      </w:r>
-    </w:p>
-    <w:p>
-      <w:pPr>
-        <w:pStyle w:val="ListParagraph"/>
-        <w:numPr>
-          <w:ilvl w:val="0"/>
-          <w:numId w:val="2"/>
-        </w:numPr>
-        <w:spacing w:after="60"/>
-      </w:pPr>
-      <w:r>
-        <w:t xml:space="preserve">"Imagine this works perfectly. Three years from now, what has changed for Moncler because of it?"</w:t>
+        <w:t xml:space="preserve">Open the story</w:t>
+      </w:r>
+    </w:p>
+    <w:p>
+      <w:pPr>
+        <w:pStyle w:val="ListParagraph"/>
+        <w:numPr>
+          <w:ilvl w:val="0"/>
+          <w:numId w:val="2"/>
+        </w:numPr>
+        <w:spacing w:after="60"/>
+      </w:pPr>
+      <w:r>
+        <w:t xml:space="preserve">"Tell me where Moncler is right now, in your own words. What is going well, and what is the next mountain to climb?"</w:t>
+      </w:r>
+    </w:p>
+    <w:p>
+      <w:pPr>
+        <w:pStyle w:val="ListParagraph"/>
+        <w:numPr>
+          <w:ilvl w:val="0"/>
+          <w:numId w:val="2"/>
+        </w:numPr>
+        <w:spacing w:after="60"/>
+      </w:pPr>
+      <w:r>
+        <w:t xml:space="preserve">"When you and your team talk about the next three years, what comes up again and again?"</w:t>
       </w:r>
     </w:p>
     <w:p>
@@ -1306,33 +1306,33 @@
         <w:spacing w:after="100" w:before="240"/>
       </w:pPr>
       <w:r>
-        <w:t xml:space="preserve">Brand fit</w:t>
-      </w:r>
-    </w:p>
-    <w:p>
-      <w:pPr>
-        <w:pStyle w:val="ListParagraph"/>
-        <w:numPr>
-          <w:ilvl w:val="0"/>
-          <w:numId w:val="2"/>
-        </w:numPr>
-        <w:spacing w:after="60"/>
-      </w:pPr>
-      <w:r>
-        <w:t xml:space="preserve">"Moncler means the mountain, craft, and now co-creation through Genius. Which of those stories would you want Formula 1 to amplify?"</w:t>
-      </w:r>
-    </w:p>
-    <w:p>
-      <w:pPr>
-        <w:pStyle w:val="ListParagraph"/>
-        <w:numPr>
-          <w:ilvl w:val="0"/>
-          <w:numId w:val="2"/>
-        </w:numPr>
-        <w:spacing w:after="60"/>
-      </w:pPr>
-      <w:r>
-        <w:t xml:space="preserve">"Project Mondo G was a statement piece with Mercedes-Benz. Did that appetite for the automotive world continue inside the house?"</w:t>
+        <w:t xml:space="preserve">Objectives, the dream and the fear</w:t>
+      </w:r>
+    </w:p>
+    <w:p>
+      <w:pPr>
+        <w:pStyle w:val="ListParagraph"/>
+        <w:numPr>
+          <w:ilvl w:val="0"/>
+          <w:numId w:val="2"/>
+        </w:numPr>
+        <w:spacing w:after="60"/>
+      </w:pPr>
+      <w:r>
+        <w:t xml:space="preserve">"Imagine we did something in Formula 1 together and it worked beautifully. Three years from now, what is different for Moncler?"</w:t>
+      </w:r>
+    </w:p>
+    <w:p>
+      <w:pPr>
+        <w:pStyle w:val="ListParagraph"/>
+        <w:numPr>
+          <w:ilvl w:val="0"/>
+          <w:numId w:val="2"/>
+        </w:numPr>
+        <w:spacing w:after="60"/>
+      </w:pPr>
+      <w:r>
+        <w:t xml:space="preserve">"And the other side: what would make it a failure in your eyes? Sometimes that answer tells us more than the first one."</w:t>
       </w:r>
     </w:p>
     <w:p>
@@ -1341,33 +1341,59 @@
         <w:spacing w:after="100" w:before="240"/>
       </w:pPr>
       <w:r>
-        <w:t xml:space="preserve">Audience</w:t>
-      </w:r>
-    </w:p>
-    <w:p>
-      <w:pPr>
-        <w:pStyle w:val="ListParagraph"/>
-        <w:numPr>
-          <w:ilvl w:val="0"/>
-          <w:numId w:val="2"/>
-        </w:numPr>
-        <w:spacing w:after="60"/>
-      </w:pPr>
-      <w:r>
-        <w:t xml:space="preserve">"Who is the customer you most want to win next: younger, more female, more American, more Asian?"</w:t>
-      </w:r>
-    </w:p>
-    <w:p>
-      <w:pPr>
-        <w:pStyle w:val="ListParagraph"/>
-        <w:numPr>
-          <w:ilvl w:val="0"/>
-          <w:numId w:val="2"/>
-        </w:numPr>
-        <w:spacing w:after="60"/>
-      </w:pPr>
-      <w:r>
-        <w:t xml:space="preserve">"How important is reaching new customers versus giving something special to your existing clients?"</w:t>
+        <w:t xml:space="preserve">The Mercedes-Benz experience (Project Mondo G)</w:t>
+      </w:r>
+    </w:p>
+    <w:p>
+      <w:pPr>
+        <w:pStyle w:val="ListParagraph"/>
+        <w:numPr>
+          <w:ilvl w:val="0"/>
+          <w:numId w:val="2"/>
+        </w:numPr>
+        <w:spacing w:after="60"/>
+      </w:pPr>
+      <w:r>
+        <w:t xml:space="preserve">"You have touched the car world once already: Project Mondo G with Mercedes-Benz. I am curious, how was that experience for the house?"</w:t>
+      </w:r>
+    </w:p>
+    <w:p>
+      <w:pPr>
+        <w:pStyle w:val="ListParagraph"/>
+        <w:numPr>
+          <w:ilvl w:val="0"/>
+          <w:numId w:val="2"/>
+        </w:numPr>
+        <w:spacing w:after="60"/>
+      </w:pPr>
+      <w:r>
+        <w:t xml:space="preserve">"What did it do for the brand? And did anything surprise you, good or bad?"</w:t>
+      </w:r>
+    </w:p>
+    <w:p>
+      <w:pPr>
+        <w:pStyle w:val="ListParagraph"/>
+        <w:numPr>
+          <w:ilvl w:val="0"/>
+          <w:numId w:val="2"/>
+        </w:numPr>
+        <w:spacing w:after="60"/>
+      </w:pPr>
+      <w:r>
+        <w:t xml:space="preserve">"If you played in the automotive world again, what would you keep, and what would you do differently?"</w:t>
+      </w:r>
+    </w:p>
+    <w:p>
+      <w:pPr>
+        <w:pStyle w:val="ListParagraph"/>
+        <w:numPr>
+          <w:ilvl w:val="0"/>
+          <w:numId w:val="2"/>
+        </w:numPr>
+        <w:spacing w:after="60"/>
+      </w:pPr>
+      <w:r>
+        <w:t xml:space="preserve">"Did Mondo G stay a beautiful one-off, or did it leave an appetite inside the house for more of that world?"</w:t>
       </w:r>
     </w:p>
     <w:p>
@@ -1376,20 +1402,33 @@
         <w:spacing w:after="100" w:before="240"/>
       </w:pPr>
       <w:r>
-        <w:t xml:space="preserve">Markets</w:t>
-      </w:r>
-    </w:p>
-    <w:p>
-      <w:pPr>
-        <w:pStyle w:val="ListParagraph"/>
-        <w:numPr>
-          <w:ilvl w:val="0"/>
-          <w:numId w:val="2"/>
-        </w:numPr>
-        <w:spacing w:after="60"/>
-      </w:pPr>
-      <w:r>
-        <w:t xml:space="preserve">"Which markets matter most for the next three years? The calendar covers all of them: Monaco, Miami, Las Vegas, Shanghai, Singapore."</w:t>
+        <w:t xml:space="preserve">Audience</w:t>
+      </w:r>
+    </w:p>
+    <w:p>
+      <w:pPr>
+        <w:pStyle w:val="ListParagraph"/>
+        <w:numPr>
+          <w:ilvl w:val="0"/>
+          <w:numId w:val="2"/>
+        </w:numPr>
+        <w:spacing w:after="60"/>
+      </w:pPr>
+      <w:r>
+        <w:t xml:space="preserve">"Describe the customer you most want to win next. Who are they, where do they live, what do they care about?"</w:t>
+      </w:r>
+    </w:p>
+    <w:p>
+      <w:pPr>
+        <w:pStyle w:val="ListParagraph"/>
+        <w:numPr>
+          <w:ilvl w:val="0"/>
+          <w:numId w:val="2"/>
+        </w:numPr>
+        <w:spacing w:after="60"/>
+      </w:pPr>
+      <w:r>
+        <w:t xml:space="preserve">"And your existing top clients: what do you give them today that money cannot buy? I ask because that is exactly the currency of this sport."</w:t>
       </w:r>
     </w:p>
     <w:p>
@@ -1398,20 +1437,20 @@
         <w:spacing w:after="100" w:before="240"/>
       </w:pPr>
       <w:r>
-        <w:t xml:space="preserve">Product and integration</w:t>
-      </w:r>
-    </w:p>
-    <w:p>
-      <w:pPr>
-        <w:pStyle w:val="ListParagraph"/>
-        <w:numPr>
-          <w:ilvl w:val="0"/>
-          <w:numId w:val="2"/>
-        </w:numPr>
-        <w:spacing w:after="60"/>
-      </w:pPr>
-      <w:r>
-        <w:t xml:space="preserve">"Would you want Moncler visible on people, not just on boards? Think off-track wardrobe, travel wear, the paddock arrivals that get photographed every weekend. Is product integration like that interesting, or is this more about experiences and clients?"</w:t>
+        <w:t xml:space="preserve">Brand story</w:t>
+      </w:r>
+    </w:p>
+    <w:p>
+      <w:pPr>
+        <w:pStyle w:val="ListParagraph"/>
+        <w:numPr>
+          <w:ilvl w:val="0"/>
+          <w:numId w:val="2"/>
+        </w:numPr>
+        <w:spacing w:after="60"/>
+      </w:pPr>
+      <w:r>
+        <w:t xml:space="preserve">"Moncler means the mountain, craft, and now co-creation through Genius. If Formula 1 could amplify only one of those stories, which one should it be?"</w:t>
       </w:r>
     </w:p>
     <w:p>
@@ -1420,33 +1459,20 @@
         <w:spacing w:after="100" w:before="240"/>
       </w:pPr>
       <w:r>
-        <w:t xml:space="preserve">Budget and timing</w:t>
-      </w:r>
-    </w:p>
-    <w:p>
-      <w:pPr>
-        <w:pStyle w:val="ListParagraph"/>
-        <w:numPr>
-          <w:ilvl w:val="0"/>
-          <w:numId w:val="2"/>
-        </w:numPr>
-        <w:spacing w:after="60"/>
-      </w:pPr>
-      <w:r>
-        <w:t xml:space="preserve">"Have you set a budget range for this? Even a rough range helps me filter what is realistic."</w:t>
-      </w:r>
-    </w:p>
-    <w:p>
-      <w:pPr>
-        <w:pStyle w:val="ListParagraph"/>
-        <w:numPr>
-          <w:ilvl w:val="0"/>
-          <w:numId w:val="2"/>
-        </w:numPr>
-        <w:spacing w:after="60"/>
-      </w:pPr>
-      <w:r>
-        <w:t xml:space="preserve">"When would you want to be live? Partnerships here usually run three to five seasons, though fashion collaborations can also start with a capsule."</w:t>
+        <w:t xml:space="preserve">Markets</w:t>
+      </w:r>
+    </w:p>
+    <w:p>
+      <w:pPr>
+        <w:pStyle w:val="ListParagraph"/>
+        <w:numPr>
+          <w:ilvl w:val="0"/>
+          <w:numId w:val="2"/>
+        </w:numPr>
+        <w:spacing w:after="60"/>
+      </w:pPr>
+      <w:r>
+        <w:t xml:space="preserve">"Which markets matter most for the next three years? And which one excites you the most? This calendar goes everywhere: Monaco, Miami, Las Vegas, Shanghai, Singapore."</w:t>
       </w:r>
     </w:p>
     <w:p>
@@ -1455,20 +1481,20 @@
         <w:spacing w:after="100" w:before="240"/>
       </w:pPr>
       <w:r>
-        <w:t xml:space="preserve">Decision process</w:t>
-      </w:r>
-    </w:p>
-    <w:p>
-      <w:pPr>
-        <w:pStyle w:val="ListParagraph"/>
-        <w:numPr>
-          <w:ilvl w:val="0"/>
-          <w:numId w:val="2"/>
-        </w:numPr>
-        <w:spacing w:after="60"/>
-      </w:pPr>
-      <w:r>
-        <w:t xml:space="preserve">"Apart from you, who shapes this decision? Mr Ruffini's office, the board?"</w:t>
+        <w:t xml:space="preserve">Product and visibility</w:t>
+      </w:r>
+    </w:p>
+    <w:p>
+      <w:pPr>
+        <w:pStyle w:val="ListParagraph"/>
+        <w:numPr>
+          <w:ilvl w:val="0"/>
+          <w:numId w:val="2"/>
+        </w:numPr>
+        <w:spacing w:after="60"/>
+      </w:pPr>
+      <w:r>
+        <w:t xml:space="preserve">"When you imagine Moncler in this sport, what do you see first: product on people, a collection, experiences for your clients, or the brand on the biggest stages? There is no wrong answer. It just points us to different doors."</w:t>
       </w:r>
     </w:p>
     <w:p>
@@ -1477,33 +1503,33 @@
         <w:spacing w:after="100" w:before="240"/>
       </w:pPr>
       <w:r>
-        <w:t xml:space="preserve">Marketing context</w:t>
-      </w:r>
-    </w:p>
-    <w:p>
-      <w:pPr>
-        <w:pStyle w:val="ListParagraph"/>
-        <w:numPr>
-          <w:ilvl w:val="0"/>
-          <w:numId w:val="2"/>
-        </w:numPr>
-        <w:spacing w:after="60"/>
-      </w:pPr>
-      <w:r>
-        <w:t xml:space="preserve">"How would this sit next to Genius, the shows, the campaigns? Would F1 be a Genius chapter or its own pillar?"</w:t>
-      </w:r>
-    </w:p>
-    <w:p>
-      <w:pPr>
-        <w:pStyle w:val="ListParagraph"/>
-        <w:numPr>
-          <w:ilvl w:val="0"/>
-          <w:numId w:val="2"/>
-        </w:numPr>
-        <w:spacing w:after="60"/>
-      </w:pPr>
-      <w:r>
-        <w:t xml:space="preserve">"Do you have the team to activate at this scale, or would you want support there too?"</w:t>
+        <w:t xml:space="preserve">Ways of working</w:t>
+      </w:r>
+    </w:p>
+    <w:p>
+      <w:pPr>
+        <w:pStyle w:val="ListParagraph"/>
+        <w:numPr>
+          <w:ilvl w:val="0"/>
+          <w:numId w:val="2"/>
+        </w:numPr>
+        <w:spacing w:after="60"/>
+      </w:pPr>
+      <w:r>
+        <w:t xml:space="preserve">"How do partnerships usually happen inside Moncler? Who falls in love with the idea first, and who has to sign it off?"</w:t>
+      </w:r>
+    </w:p>
+    <w:p>
+      <w:pPr>
+        <w:pStyle w:val="ListParagraph"/>
+        <w:numPr>
+          <w:ilvl w:val="0"/>
+          <w:numId w:val="2"/>
+        </w:numPr>
+        <w:spacing w:after="60"/>
+      </w:pPr>
+      <w:r>
+        <w:t xml:space="preserve">"And would your team activate this, the content, the drops, the events, or would you want support there too?"</w:t>
       </w:r>
     </w:p>
     <w:p>
@@ -1512,20 +1538,55 @@
         <w:spacing w:after="100" w:before="240"/>
       </w:pPr>
       <w:r>
-        <w:t xml:space="preserve">Clients and hospitality</w:t>
-      </w:r>
-    </w:p>
-    <w:p>
-      <w:pPr>
-        <w:pStyle w:val="ListParagraph"/>
-        <w:numPr>
-          <w:ilvl w:val="0"/>
-          <w:numId w:val="2"/>
-        </w:numPr>
-        <w:spacing w:after="60"/>
-      </w:pPr>
-      <w:r>
-        <w:t xml:space="preserve">"How central is clienteling for you? Would you want your top clients hosted at Monaco, Las Vegas, Milan week at Monza?"</w:t>
+        <w:t xml:space="preserve">Budget and timing</w:t>
+      </w:r>
+    </w:p>
+    <w:p>
+      <w:pPr>
+        <w:pStyle w:val="ListParagraph"/>
+        <w:numPr>
+          <w:ilvl w:val="0"/>
+          <w:numId w:val="2"/>
+        </w:numPr>
+        <w:spacing w:after="60"/>
+      </w:pPr>
+      <w:r>
+        <w:t xml:space="preserve">"Now the unromantic question: is there a budget range in mind? Even a rough one helps me bring back only what is realistic."</w:t>
+      </w:r>
+    </w:p>
+    <w:p>
+      <w:pPr>
+        <w:pStyle w:val="ListParagraph"/>
+        <w:numPr>
+          <w:ilvl w:val="0"/>
+          <w:numId w:val="2"/>
+        </w:numPr>
+        <w:spacing w:after="60"/>
+      </w:pPr>
+      <w:r>
+        <w:t xml:space="preserve">"And timing: is this a now conversation, or a next-year conversation? Both are fine. They just change what we bring back."</w:t>
+      </w:r>
+    </w:p>
+    <w:p>
+      <w:pPr>
+        <w:pStyle w:val="Heading3"/>
+        <w:spacing w:after="100" w:before="240"/>
+      </w:pPr>
+      <w:r>
+        <w:t xml:space="preserve">Hospitality</w:t>
+      </w:r>
+    </w:p>
+    <w:p>
+      <w:pPr>
+        <w:pStyle w:val="ListParagraph"/>
+        <w:numPr>
+          <w:ilvl w:val="0"/>
+          <w:numId w:val="2"/>
+        </w:numPr>
+        <w:spacing w:after="60"/>
+      </w:pPr>
+      <w:r>
+        <w:t xml:space="preserve">"Last one, and it is my favorite. If I gave you a paddock weekend in Monaco tomorrow, who would you bring, and why those people? That answer usually tells me what a partnership is really for."</w:t>
       </w:r>
     </w:p>
     <w:p>

</xml_diff>

<commit_message>
Sharpen the Moncler close into a three-step next-steps statement
Brief in writing that they approve, category and competitor mapping
across the grid plus the athlete route with Ellery, then a costed
short list in two to three weeks, with the no-cost line, the race
invitation, and questions invited to all three hosts.

Co-Authored-By: Claude Fable 5 <noreply@anthropic.com>
Claude-Session: https://claude.ai/code/session_011Vvxd2V3zerAfjn84yXuuv
</commit_message>
<xml_diff>
--- a/call-scripts/Moncler-F1-Discovery-Call-Script.docx
+++ b/call-scripts/Moncler-F1-Discovery-Call-Script.docx
@@ -3434,46 +3434,72 @@
         <w:ind w:left="280" w:right="120"/>
       </w:pPr>
       <w:r>
-        <w:t xml:space="preserve">"[Name], this was very useful. Thank you. Let me tell you what happens next, so there are no surprises.</w:t>
-      </w:r>
-    </w:p>
-    <w:p>
-      <w:pPr>
-        <w:pBdr>
-          <w:left w:val="single" w:color="1F3864" w:sz="18"/>
-        </w:pBdr>
-        <w:shd w:fill="F2F4F8" w:val="clear"/>
-        <w:spacing w:after="60" w:before="0" w:line="264"/>
-        <w:ind w:left="280" w:right="120"/>
-      </w:pPr>
-      <w:r>
-        <w:t xml:space="preserve">We take everything from today and build the brief. Then my team maps the full grid against it: which teams fit Moncler, what is available, at what level, and where you get the most value. We come back with a short list and clear recommendations. Give us [two to three weeks].</w:t>
-      </w:r>
-    </w:p>
-    <w:p>
-      <w:pPr>
-        <w:pBdr>
-          <w:left w:val="single" w:color="1F3864" w:sz="18"/>
-        </w:pBdr>
-        <w:shd w:fill="F2F4F8" w:val="clear"/>
-        <w:spacing w:after="60" w:before="0" w:line="264"/>
-        <w:ind w:left="280" w:right="120"/>
-      </w:pPr>
-      <w:r>
-        <w:t xml:space="preserve">No cost and no obligation on your side at any point. That is how we work.</w:t>
-      </w:r>
-    </w:p>
-    <w:p>
-      <w:pPr>
-        <w:pBdr>
-          <w:left w:val="single" w:color="1F3864" w:sz="18"/>
-        </w:pBdr>
-        <w:shd w:fill="F2F4F8" w:val="clear"/>
-        <w:spacing w:after="60" w:before="0" w:line="264"/>
-        <w:ind w:left="280" w:right="120"/>
-      </w:pPr>
-      <w:r>
-        <w:t xml:space="preserve">And one more thing. The best way to understand this world is to stand in it. We would be delighted to host you and your colleagues as our guests at a Grand Prix, walk the paddock, and see how the luxury houses use a race weekend. We can talk dates when the recommendations are on the table.</w:t>
+        <w:t xml:space="preserve">"[Name], this was very useful. Thank you. Let me close with exactly what happens next, so there are no surprises.</w:t>
+      </w:r>
+    </w:p>
+    <w:p>
+      <w:pPr>
+        <w:pBdr>
+          <w:left w:val="single" w:color="1F3864" w:sz="18"/>
+        </w:pBdr>
+        <w:shd w:fill="F2F4F8" w:val="clear"/>
+        <w:spacing w:after="60" w:before="0" w:line="264"/>
+        <w:ind w:left="280" w:right="120"/>
+      </w:pPr>
+      <w:r>
+        <w:t xml:space="preserve">Step one, we take everything you shared today and turn it into a brief. You will see it in writing, and you can correct it. Nothing moves until you tell us it is right.</w:t>
+      </w:r>
+    </w:p>
+    <w:p>
+      <w:pPr>
+        <w:pBdr>
+          <w:left w:val="single" w:color="1F3864" w:sz="18"/>
+        </w:pBdr>
+        <w:shd w:fill="F2F4F8" w:val="clear"/>
+        <w:spacing w:after="60" w:before="0" w:line="264"/>
+        <w:ind w:left="280" w:right="120"/>
+      </w:pPr>
+      <w:r>
+        <w:t xml:space="preserve">Step two, my team goes to work on that brief. We define your category and your direct competitors, and we map that across all eleven teams: what is truly available, at which levels, and where Moncler gets the most value. And because Ellery is here, we look at the athlete route as well, not only the teams.</w:t>
+      </w:r>
+    </w:p>
+    <w:p>
+      <w:pPr>
+        <w:pBdr>
+          <w:left w:val="single" w:color="1F3864" w:sz="18"/>
+        </w:pBdr>
+        <w:shd w:fill="F2F4F8" w:val="clear"/>
+        <w:spacing w:after="60" w:before="0" w:line="264"/>
+        <w:ind w:left="280" w:right="120"/>
+      </w:pPr>
+      <w:r>
+        <w:t xml:space="preserve">Step three, we come back with a short list and clear recommendations. Give us [two to three weeks]. Every option will show what it includes, what it costs, and why it fits your brief.</w:t>
+      </w:r>
+    </w:p>
+    <w:p>
+      <w:pPr>
+        <w:pBdr>
+          <w:left w:val="single" w:color="1F3864" w:sz="18"/>
+        </w:pBdr>
+        <w:shd w:fill="F2F4F8" w:val="clear"/>
+        <w:spacing w:after="60" w:before="0" w:line="264"/>
+        <w:ind w:left="280" w:right="120"/>
+      </w:pPr>
+      <w:r>
+        <w:t xml:space="preserve">Through all of this, no cost and no obligation on your side. The teams pay our fee, so our advice is free for you. That is how we work.</w:t>
+      </w:r>
+    </w:p>
+    <w:p>
+      <w:pPr>
+        <w:pBdr>
+          <w:left w:val="single" w:color="1F3864" w:sz="18"/>
+        </w:pBdr>
+        <w:shd w:fill="F2F4F8" w:val="clear"/>
+        <w:spacing w:after="60" w:before="0" w:line="264"/>
+        <w:ind w:left="280" w:right="120"/>
+      </w:pPr>
+      <w:r>
+        <w:t xml:space="preserve">And one more thing. The best way to understand this world is to stand in it. We would be delighted to host you and your colleagues as our guests at a Grand Prix, walk the paddock, and see how the luxury houses use a race weekend. We can pick dates once the recommendations are on the table.</w:t>
       </w:r>
     </w:p>
     <w:p>
@@ -3486,7 +3512,7 @@
         <w:ind w:left="280" w:right="120"/>
       </w:pPr>
       <w:r>
-        <w:t xml:space="preserve">Before we finish, what questions do you have for me?"</w:t>
+        <w:t xml:space="preserve">Does that work as a plan? And before we finish, what questions do you have for me, for Bjorn, or for Ellery?"</w:t>
       </w:r>
     </w:p>
     <w:p>

</xml_diff>